<commit_message>
tabella traduzione e aggiornamento manuale utente
</commit_message>
<xml_diff>
--- a/Progettazione/Manuale utente.docx
+++ b/Progettazione/Manuale utente.docx
@@ -11,8 +11,96 @@
         </w:docPartObj>
       </w:sdtPr>
       <w:sdtContent>
-        <w:p/>
         <w:p>
+          <w:pPr>
+            <w:jc w:val="both"/>
+          </w:pPr>
+        </w:p>
+        <w:p>
+          <w:pPr>
+            <w:jc w:val="both"/>
+          </w:pPr>
+          <w:r>
+            <w:rPr>
+              <w:noProof/>
+            </w:rPr>
+            <mc:AlternateContent>
+              <mc:Choice Requires="wps">
+                <w:drawing>
+                  <wp:anchor distT="0" distB="0" distL="114300" distR="114300" simplePos="0" relativeHeight="251664384" behindDoc="0" locked="0" layoutInCell="1" allowOverlap="1" wp14:anchorId="51C60F20" wp14:editId="0819FBA9">
+                    <wp:simplePos x="0" y="0"/>
+                    <wp:positionH relativeFrom="column">
+                      <wp:posOffset>5040630</wp:posOffset>
+                    </wp:positionH>
+                    <wp:positionV relativeFrom="paragraph">
+                      <wp:posOffset>6762115</wp:posOffset>
+                    </wp:positionV>
+                    <wp:extent cx="1394460" cy="289560"/>
+                    <wp:effectExtent l="0" t="0" r="15240" b="15240"/>
+                    <wp:wrapNone/>
+                    <wp:docPr id="402651620" name="Casella di testo 6"/>
+                    <wp:cNvGraphicFramePr/>
+                    <a:graphic xmlns:a="http://schemas.openxmlformats.org/drawingml/2006/main">
+                      <a:graphicData uri="http://schemas.microsoft.com/office/word/2010/wordprocessingShape">
+                        <wps:wsp>
+                          <wps:cNvSpPr txBox="1"/>
+                          <wps:spPr>
+                            <a:xfrm>
+                              <a:off x="0" y="0"/>
+                              <a:ext cx="1394460" cy="289560"/>
+                            </a:xfrm>
+                            <a:prstGeom prst="rect">
+                              <a:avLst/>
+                            </a:prstGeom>
+                            <a:noFill/>
+                            <a:ln w="6350">
+                              <a:solidFill>
+                                <a:schemeClr val="accent4"/>
+                              </a:solidFill>
+                            </a:ln>
+                          </wps:spPr>
+                          <wps:txbx>
+                            <w:txbxContent>
+                              <w:p>
+                                <w:r>
+                                  <w:t>Versione</w:t>
+                                </w:r>
+                              </w:p>
+                            </w:txbxContent>
+                          </wps:txbx>
+                          <wps:bodyPr rot="0" spcFirstLastPara="0" vertOverflow="overflow" horzOverflow="overflow" vert="horz" wrap="square" lIns="91440" tIns="45720" rIns="91440" bIns="45720" numCol="1" spcCol="0" rtlCol="0" fromWordArt="0" anchor="t" anchorCtr="0" forceAA="0" compatLnSpc="1">
+                            <a:prstTxWarp prst="textNoShape">
+                              <a:avLst/>
+                            </a:prstTxWarp>
+                            <a:noAutofit/>
+                          </wps:bodyPr>
+                        </wps:wsp>
+                      </a:graphicData>
+                    </a:graphic>
+                  </wp:anchor>
+                </w:drawing>
+              </mc:Choice>
+              <mc:Fallback>
+                <w:pict>
+                  <v:shapetype w14:anchorId="51C60F20" id="_x0000_t202" coordsize="21600,21600" o:spt="202" path="m,l,21600r21600,l21600,xe">
+                    <v:stroke joinstyle="miter"/>
+                    <v:path gradientshapeok="t" o:connecttype="rect"/>
+                  </v:shapetype>
+                  <v:shape id="Casella di testo 6" o:spid="_x0000_s1026" type="#_x0000_t202" style="position:absolute;left:0;text-align:left;margin-left:396.9pt;margin-top:532.45pt;width:109.8pt;height:22.8pt;z-index:251664384;visibility:visible;mso-wrap-style:square;mso-wrap-distance-left:9pt;mso-wrap-distance-top:0;mso-wrap-distance-right:9pt;mso-wrap-distance-bottom:0;mso-position-horizontal:absolute;mso-position-horizontal-relative:text;mso-position-vertical:absolute;mso-position-vertical-relative:text;v-text-anchor:top" o:gfxdata="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" filled="f" strokecolor="#ffc000 [3207]" strokeweight=".5pt">
+                    <v:textbox>
+                      <w:txbxContent>
+                        <w:p>
+                          <w:r>
+                            <w:t>Versione</w:t>
+                          </w:r>
+                        </w:p>
+                      </w:txbxContent>
+                    </v:textbox>
+                  </v:shape>
+                </w:pict>
+              </mc:Fallback>
+            </mc:AlternateContent>
+          </w:r>
           <w:r>
             <w:rPr>
               <w:noProof/>
@@ -88,13 +176,7 @@
                                   </w:sdtPr>
                                   <w:sdtContent>
                                     <w:r>
-                                      <w:t>Università degli studi dell’</w:t>
-                                    </w:r>
-                                    <w:r>
-                                      <w:t>I</w:t>
-                                    </w:r>
-                                    <w:r>
-                                      <w:t>nsubria</w:t>
+                                      <w:t>Università degli studi dell’Insubria</w:t>
                                     </w:r>
                                   </w:sdtContent>
                                 </w:sdt>
@@ -152,11 +234,7 @@
               </mc:Choice>
               <mc:Fallback>
                 <w:pict>
-                  <v:shapetype w14:anchorId="519EE8C7" id="_x0000_t202" coordsize="21600,21600" o:spt="202" path="m,l,21600r21600,l21600,xe">
-                    <v:stroke joinstyle="miter"/>
-                    <v:path gradientshapeok="t" o:connecttype="rect"/>
-                  </v:shapetype>
-                  <v:shape id="Casella di testo 128" o:spid="_x0000_s1026" type="#_x0000_t202" style="position:absolute;margin-left:0;margin-top:700.75pt;width:354.6pt;height:16.2pt;z-index:251662336;visibility:visible;mso-wrap-style:square;mso-width-percent:0;mso-height-percent:0;mso-wrap-distance-left:9pt;mso-wrap-distance-top:0;mso-wrap-distance-right:9pt;mso-wrap-distance-bottom:0;mso-position-horizontal:left;mso-position-horizontal-relative:margin;mso-position-vertical:absolute;mso-position-vertical-relative:margin;mso-width-percent:0;mso-height-percent:0;mso-width-relative:margin;mso-height-relative:margin;v-text-anchor:bottom" o:gfxdata="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" filled="f" strokecolor="#ffc000 [3207]" strokeweight=".5pt">
+                  <v:shape w14:anchorId="519EE8C7" id="Casella di testo 128" o:spid="_x0000_s1027" type="#_x0000_t202" style="position:absolute;left:0;text-align:left;margin-left:0;margin-top:700.75pt;width:354.6pt;height:16.2pt;z-index:251662336;visibility:visible;mso-wrap-style:square;mso-width-percent:0;mso-height-percent:0;mso-wrap-distance-left:9pt;mso-wrap-distance-top:0;mso-wrap-distance-right:9pt;mso-wrap-distance-bottom:0;mso-position-horizontal:left;mso-position-horizontal-relative:margin;mso-position-vertical:absolute;mso-position-vertical-relative:margin;mso-width-percent:0;mso-height-percent:0;mso-width-relative:margin;mso-height-relative:margin;v-text-anchor:bottom" o:gfxdata="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" filled="f" strokecolor="#ffc000 [3207]" strokeweight=".5pt">
                     <v:textbox inset="1in,0,86.4pt,0">
                       <w:txbxContent>
                         <w:p>
@@ -178,13 +256,7 @@
                             </w:sdtPr>
                             <w:sdtContent>
                               <w:r>
-                                <w:t>Università degli studi dell’</w:t>
-                              </w:r>
-                              <w:r>
-                                <w:t>I</w:t>
-                              </w:r>
-                              <w:r>
-                                <w:t>nsubria</w:t>
+                                <w:t>Università degli studi dell’Insubria</w:t>
                               </w:r>
                             </w:sdtContent>
                           </w:sdt>
@@ -350,7 +422,6 @@
                                     <w:szCs w:val="24"/>
                                   </w:rPr>
                                 </w:pPr>
-                                <w:proofErr w:type="spellStart"/>
                                 <w:r>
                                   <w:rPr>
                                     <w:rStyle w:val="Enfasigrassetto"/>
@@ -359,18 +430,7 @@
                                     <w:sz w:val="24"/>
                                     <w:szCs w:val="24"/>
                                   </w:rPr>
-                                  <w:t>Barlera</w:t>
-                                </w:r>
-                                <w:proofErr w:type="spellEnd"/>
-                                <w:r>
-                                  <w:rPr>
-                                    <w:rStyle w:val="Enfasigrassetto"/>
-                                    <w:b w:val="0"/>
-                                    <w:bCs w:val="0"/>
-                                    <w:sz w:val="24"/>
-                                    <w:szCs w:val="24"/>
-                                  </w:rPr>
-                                  <w:t xml:space="preserve"> Marco</w:t>
+                                  <w:t>Barlera Marco</w:t>
                                 </w:r>
                               </w:p>
                               <w:p>
@@ -476,7 +536,7 @@
               </mc:Choice>
               <mc:Fallback>
                 <w:pict>
-                  <v:shape w14:anchorId="52064168" id="Casella di testo 129" o:spid="_x0000_s1027" type="#_x0000_t202" style="position:absolute;margin-left:19.8pt;margin-top:613.2pt;width:453pt;height:141.6pt;z-index:251661312;visibility:visible;mso-wrap-style:square;mso-width-percent:1154;mso-height-percent:0;mso-wrap-distance-left:9pt;mso-wrap-distance-top:0;mso-wrap-distance-right:9pt;mso-wrap-distance-bottom:0;mso-position-horizontal:absolute;mso-position-horizontal-relative:page;mso-position-vertical:absolute;mso-position-vertical-relative:page;mso-width-percent:1154;mso-height-percent:0;mso-width-relative:margin;mso-height-relative:margin;v-text-anchor:top" o:gfxdata="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" filled="f" strokecolor="#ffc000 [3207]" strokeweight=".5pt">
+                  <v:shape w14:anchorId="52064168" id="Casella di testo 129" o:spid="_x0000_s1028" type="#_x0000_t202" style="position:absolute;left:0;text-align:left;margin-left:19.8pt;margin-top:613.2pt;width:453pt;height:141.6pt;z-index:251661312;visibility:visible;mso-wrap-style:square;mso-width-percent:1154;mso-height-percent:0;mso-wrap-distance-left:9pt;mso-wrap-distance-top:0;mso-wrap-distance-right:9pt;mso-wrap-distance-bottom:0;mso-position-horizontal:absolute;mso-position-horizontal-relative:page;mso-position-vertical:absolute;mso-position-vertical-relative:page;mso-width-percent:1154;mso-height-percent:0;mso-width-relative:margin;mso-height-relative:margin;v-text-anchor:top" o:gfxdata="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" filled="f" strokecolor="#ffc000 [3207]" strokeweight=".5pt">
                     <v:textbox inset="1in,0,86.4pt,0">
                       <w:txbxContent>
                         <w:sdt>
@@ -545,7 +605,6 @@
                               <w:szCs w:val="24"/>
                             </w:rPr>
                           </w:pPr>
-                          <w:proofErr w:type="spellStart"/>
                           <w:r>
                             <w:rPr>
                               <w:rStyle w:val="Enfasigrassetto"/>
@@ -554,18 +613,7 @@
                               <w:sz w:val="24"/>
                               <w:szCs w:val="24"/>
                             </w:rPr>
-                            <w:t>Barlera</w:t>
-                          </w:r>
-                          <w:proofErr w:type="spellEnd"/>
-                          <w:r>
-                            <w:rPr>
-                              <w:rStyle w:val="Enfasigrassetto"/>
-                              <w:b w:val="0"/>
-                              <w:bCs w:val="0"/>
-                              <w:sz w:val="24"/>
-                              <w:szCs w:val="24"/>
-                            </w:rPr>
-                            <w:t xml:space="preserve"> Marco</w:t>
+                            <w:t>Barlera Marco</w:t>
                           </w:r>
                         </w:p>
                         <w:p>
@@ -719,7 +767,7 @@
               </mc:Choice>
               <mc:Fallback>
                 <w:pict>
-                  <v:shape w14:anchorId="6B1F7B35" id="Casella di testo 1" o:spid="_x0000_s1028" type="#_x0000_t202" style="position:absolute;margin-left:383.1pt;margin-top:677.05pt;width:133.8pt;height:19.2pt;z-index:251663360;visibility:visible;mso-wrap-style:square;mso-wrap-distance-left:9pt;mso-wrap-distance-top:0;mso-wrap-distance-right:9pt;mso-wrap-distance-bottom:0;mso-position-horizontal:absolute;mso-position-horizontal-relative:text;mso-position-vertical:absolute;mso-position-vertical-relative:text;v-text-anchor:top" o:gfxdata="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" filled="f" strokecolor="#ffc000 [3207]" strokeweight=".5pt">
+                  <v:shape w14:anchorId="6B1F7B35" id="Casella di testo 1" o:spid="_x0000_s1029" type="#_x0000_t202" style="position:absolute;left:0;text-align:left;margin-left:383.1pt;margin-top:677.05pt;width:133.8pt;height:19.2pt;z-index:251663360;visibility:visible;mso-wrap-style:square;mso-wrap-distance-left:9pt;mso-wrap-distance-top:0;mso-wrap-distance-right:9pt;mso-wrap-distance-bottom:0;mso-position-horizontal:absolute;mso-position-horizontal-relative:text;mso-position-vertical:absolute;mso-position-vertical-relative:text;v-text-anchor:top" o:gfxdata="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" filled="f" strokecolor="#ffc000 [3207]" strokeweight=".5pt">
                     <v:textbox>
                       <w:txbxContent>
                         <w:p>
@@ -1066,9 +1114,9 @@
               </mc:Choice>
               <mc:Fallback>
                 <w:pict>
-                  <v:group w14:anchorId="1844AF1E" id="Gruppo 126" o:spid="_x0000_s1029" style="position:absolute;margin-left:0;margin-top:0;width:540pt;height:556.55pt;z-index:-251657216;mso-width-percent:1154;mso-height-percent:670;mso-top-percent:45;mso-position-horizontal:center;mso-position-horizontal-relative:margin;mso-position-vertical-relative:page;mso-width-percent:1154;mso-height-percent:670;mso-top-percent:45;mso-width-relative:margin" coordsize="55613,54044" o:gfxdata="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">
+                  <v:group w14:anchorId="1844AF1E" id="Gruppo 126" o:spid="_x0000_s1030" style="position:absolute;left:0;text-align:left;margin-left:0;margin-top:0;width:540pt;height:556.55pt;z-index:-251657216;mso-width-percent:1154;mso-height-percent:670;mso-top-percent:45;mso-position-horizontal:center;mso-position-horizontal-relative:margin;mso-position-vertical-relative:page;mso-width-percent:1154;mso-height-percent:670;mso-top-percent:45;mso-width-relative:margin" coordsize="55613,54044" o:gfxdata="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">
                     <o:lock v:ext="edit" aspectratio="t"/>
-                    <v:shape id="Figura a mano libera 10" o:spid="_x0000_s1030" style="position:absolute;width:55575;height:54044;visibility:visible;mso-wrap-style:square;v-text-anchor:bottom" coordsize="720,700" o:spt="100" o:gfxdata="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" adj="-11796480,,5400" path="m,c,644,,644,,644v23,6,62,14,113,21c250,685,476,700,720,644v,-27,,-27,,-27c720,,720,,720,,,,,,,e" fillcolor="#c00000" stroked="f">
+                    <v:shape id="Figura a mano libera 10" o:spid="_x0000_s1031" style="position:absolute;width:55575;height:54044;visibility:visible;mso-wrap-style:square;v-text-anchor:bottom" coordsize="720,700" o:spt="100" o:gfxdata="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" adj="-11796480,,5400" path="m,c,644,,644,,644v23,6,62,14,113,21c250,685,476,700,720,644v,-27,,-27,,-27c720,,720,,720,,,,,,,e" fillcolor="#c00000" stroked="f">
                       <v:stroke joinstyle="miter"/>
                       <v:formulas/>
                       <v:path arrowok="t" o:connecttype="custom" o:connectlocs="0,0;0,4972126;872222,5134261;5557520,4972126;5557520,4763667;5557520,0;0,0" o:connectangles="0,0,0,0,0,0,0" textboxrect="0,0,720,700"/>
@@ -1126,7 +1174,7 @@
                         </w:txbxContent>
                       </v:textbox>
                     </v:shape>
-                    <v:shape id="Figura a mano libera 11" o:spid="_x0000_s1031" style="position:absolute;left:8763;top:47697;width:46850;height:5099;visibility:visible;mso-wrap-style:square;v-text-anchor:bottom" coordsize="607,66" o:gfxdata="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" path="m607,c450,44,300,57,176,57,109,57,49,53,,48,66,58,152,66,251,66,358,66,480,56,607,27,607,,607,,607,e" fillcolor="white [3212]" stroked="f">
+                    <v:shape id="Figura a mano libera 11" o:spid="_x0000_s1032" style="position:absolute;left:8763;top:47697;width:46850;height:5099;visibility:visible;mso-wrap-style:square;v-text-anchor:bottom" coordsize="607,66" o:gfxdata="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" path="m607,c450,44,300,57,176,57,109,57,49,53,,48,66,58,152,66,251,66,358,66,480,56,607,27,607,,607,,607,e" fillcolor="white [3212]" stroked="f">
                       <v:fill opacity="19789f"/>
                       <v:path arrowok="t" o:connecttype="custom" o:connectlocs="4685030,0;1358427,440373;0,370840;1937302,509905;4685030,208598;4685030,0" o:connectangles="0,0,0,0,0,0"/>
                     </v:shape>
@@ -1713,7 +1761,7 @@
           <w:sz w:val="28"/>
           <w:szCs w:val="28"/>
         </w:rPr>
-        <w:t xml:space="preserve">Il programma conserva i dati in una base di dati PostgreSQL chiamata dbTK. Il database va creato eseguendo, nell'ordine, tre script SQL che si trovano nella cartella Progettazione/1_Doc. Conclusi/Database/:</w:t>
+        <w:t xml:space="preserve">Il programma conserva i dati in una base di dati PostgreSQL chiamata dbTK. Il database va creato eseguendo, nell'ordine, cinque script SQL che si trovano nella cartella Progettazione/1_Doc. Conclusi/Database/:</w:t>
       </w:r>
     </w:p>
     <w:p>
@@ -1776,7 +1824,49 @@
           <w:sz w:val="28"/>
           <w:szCs w:val="28"/>
         </w:rPr>
-        <w:t xml:space="preserve">Data.sql — carica i ristoranti del data set di prova.</w:t>
+        <w:t xml:space="preserve">Data.sql — carica i ristoranti del data set di prova;</w:t>
+      </w:r>
+    </w:p>
+    <w:p>
+      <w:pPr>
+        <w:pStyle w:val="Paragrafoelenco"/>
+        <w:numPr>
+          <w:ilvl w:val="0"/>
+          <w:numId w:val="7"/>
+        </w:numPr>
+        <w:jc w:val="both"/>
+        <w:rPr>
+          <w:sz w:val="28"/>
+          <w:szCs w:val="28"/>
+        </w:rPr>
+      </w:pPr>
+      <w:r>
+        <w:rPr>
+          <w:sz w:val="28"/>
+          <w:szCs w:val="28"/>
+        </w:rPr>
+        <w:t xml:space="preserve">AbilitaServiziTest.sql — abilita i servizi di prenotazione online e consegna a domicilio per i ristoranti di prova;</w:t>
+      </w:r>
+    </w:p>
+    <w:p>
+      <w:pPr>
+        <w:pStyle w:val="Paragrafoelenco"/>
+        <w:numPr>
+          <w:ilvl w:val="0"/>
+          <w:numId w:val="7"/>
+        </w:numPr>
+        <w:jc w:val="both"/>
+        <w:rPr>
+          <w:sz w:val="28"/>
+          <w:szCs w:val="28"/>
+        </w:rPr>
+      </w:pPr>
+      <w:r>
+        <w:rPr>
+          <w:sz w:val="28"/>
+          <w:szCs w:val="28"/>
+        </w:rPr>
+        <w:t xml:space="preserve">PopolaRecensioniTest.sql — inserisce recensioni fittizie per popolare il data set di test.</w:t>
       </w:r>
     </w:p>
     <w:p>
@@ -2946,6 +3036,751 @@
     </w:lvl>
   </w:abstractNum>
   <w:abstractNum w:abstractNumId="1" w15:restartNumberingAfterBreak="0">
+    <w:nsid w:val="0AF9234C"/>
+    <w:multiLevelType w:val="multilevel"/>
+    <w:tmpl w:val="B4F818E8"/>
+    <w:lvl w:ilvl="0">
+      <w:start w:val="1"/>
+      <w:numFmt w:val="bullet"/>
+      <w:lvlText w:val=""/>
+      <w:lvlJc w:val="left"/>
+      <w:pPr>
+        <w:tabs>
+          <w:tab w:val="num" w:pos="720"/>
+        </w:tabs>
+        <w:ind w:left="720" w:hanging="360"/>
+      </w:pPr>
+      <w:rPr>
+        <w:rFonts w:ascii="Symbol" w:hAnsi="Symbol" w:hint="default"/>
+        <w:sz w:val="20"/>
+      </w:rPr>
+    </w:lvl>
+    <w:lvl w:ilvl="1" w:tentative="1">
+      <w:start w:val="1"/>
+      <w:numFmt w:val="bullet"/>
+      <w:lvlText w:val="o"/>
+      <w:lvlJc w:val="left"/>
+      <w:pPr>
+        <w:tabs>
+          <w:tab w:val="num" w:pos="1440"/>
+        </w:tabs>
+        <w:ind w:left="1440" w:hanging="360"/>
+      </w:pPr>
+      <w:rPr>
+        <w:rFonts w:ascii="Courier New" w:hAnsi="Courier New" w:hint="default"/>
+        <w:sz w:val="20"/>
+      </w:rPr>
+    </w:lvl>
+    <w:lvl w:ilvl="2" w:tentative="1">
+      <w:start w:val="1"/>
+      <w:numFmt w:val="bullet"/>
+      <w:lvlText w:val=""/>
+      <w:lvlJc w:val="left"/>
+      <w:pPr>
+        <w:tabs>
+          <w:tab w:val="num" w:pos="2160"/>
+        </w:tabs>
+        <w:ind w:left="2160" w:hanging="360"/>
+      </w:pPr>
+      <w:rPr>
+        <w:rFonts w:ascii="Wingdings" w:hAnsi="Wingdings" w:hint="default"/>
+        <w:sz w:val="20"/>
+      </w:rPr>
+    </w:lvl>
+    <w:lvl w:ilvl="3" w:tentative="1">
+      <w:start w:val="1"/>
+      <w:numFmt w:val="bullet"/>
+      <w:lvlText w:val=""/>
+      <w:lvlJc w:val="left"/>
+      <w:pPr>
+        <w:tabs>
+          <w:tab w:val="num" w:pos="2880"/>
+        </w:tabs>
+        <w:ind w:left="2880" w:hanging="360"/>
+      </w:pPr>
+      <w:rPr>
+        <w:rFonts w:ascii="Wingdings" w:hAnsi="Wingdings" w:hint="default"/>
+        <w:sz w:val="20"/>
+      </w:rPr>
+    </w:lvl>
+    <w:lvl w:ilvl="4" w:tentative="1">
+      <w:start w:val="1"/>
+      <w:numFmt w:val="bullet"/>
+      <w:lvlText w:val=""/>
+      <w:lvlJc w:val="left"/>
+      <w:pPr>
+        <w:tabs>
+          <w:tab w:val="num" w:pos="3600"/>
+        </w:tabs>
+        <w:ind w:left="3600" w:hanging="360"/>
+      </w:pPr>
+      <w:rPr>
+        <w:rFonts w:ascii="Wingdings" w:hAnsi="Wingdings" w:hint="default"/>
+        <w:sz w:val="20"/>
+      </w:rPr>
+    </w:lvl>
+    <w:lvl w:ilvl="5" w:tentative="1">
+      <w:start w:val="1"/>
+      <w:numFmt w:val="bullet"/>
+      <w:lvlText w:val=""/>
+      <w:lvlJc w:val="left"/>
+      <w:pPr>
+        <w:tabs>
+          <w:tab w:val="num" w:pos="4320"/>
+        </w:tabs>
+        <w:ind w:left="4320" w:hanging="360"/>
+      </w:pPr>
+      <w:rPr>
+        <w:rFonts w:ascii="Wingdings" w:hAnsi="Wingdings" w:hint="default"/>
+        <w:sz w:val="20"/>
+      </w:rPr>
+    </w:lvl>
+    <w:lvl w:ilvl="6" w:tentative="1">
+      <w:start w:val="1"/>
+      <w:numFmt w:val="bullet"/>
+      <w:lvlText w:val=""/>
+      <w:lvlJc w:val="left"/>
+      <w:pPr>
+        <w:tabs>
+          <w:tab w:val="num" w:pos="5040"/>
+        </w:tabs>
+        <w:ind w:left="5040" w:hanging="360"/>
+      </w:pPr>
+      <w:rPr>
+        <w:rFonts w:ascii="Wingdings" w:hAnsi="Wingdings" w:hint="default"/>
+        <w:sz w:val="20"/>
+      </w:rPr>
+    </w:lvl>
+    <w:lvl w:ilvl="7" w:tentative="1">
+      <w:start w:val="1"/>
+      <w:numFmt w:val="bullet"/>
+      <w:lvlText w:val=""/>
+      <w:lvlJc w:val="left"/>
+      <w:pPr>
+        <w:tabs>
+          <w:tab w:val="num" w:pos="5760"/>
+        </w:tabs>
+        <w:ind w:left="5760" w:hanging="360"/>
+      </w:pPr>
+      <w:rPr>
+        <w:rFonts w:ascii="Wingdings" w:hAnsi="Wingdings" w:hint="default"/>
+        <w:sz w:val="20"/>
+      </w:rPr>
+    </w:lvl>
+    <w:lvl w:ilvl="8" w:tentative="1">
+      <w:start w:val="1"/>
+      <w:numFmt w:val="bullet"/>
+      <w:lvlText w:val=""/>
+      <w:lvlJc w:val="left"/>
+      <w:pPr>
+        <w:tabs>
+          <w:tab w:val="num" w:pos="6480"/>
+        </w:tabs>
+        <w:ind w:left="6480" w:hanging="360"/>
+      </w:pPr>
+      <w:rPr>
+        <w:rFonts w:ascii="Wingdings" w:hAnsi="Wingdings" w:hint="default"/>
+        <w:sz w:val="20"/>
+      </w:rPr>
+    </w:lvl>
+  </w:abstractNum>
+  <w:abstractNum w:abstractNumId="2" w15:restartNumberingAfterBreak="0">
+    <w:nsid w:val="0ED665DA"/>
+    <w:multiLevelType w:val="multilevel"/>
+    <w:tmpl w:val="58120B34"/>
+    <w:lvl w:ilvl="0">
+      <w:start w:val="1"/>
+      <w:numFmt w:val="bullet"/>
+      <w:lvlText w:val=""/>
+      <w:lvlJc w:val="left"/>
+      <w:pPr>
+        <w:tabs>
+          <w:tab w:val="num" w:pos="720"/>
+        </w:tabs>
+        <w:ind w:left="720" w:hanging="360"/>
+      </w:pPr>
+      <w:rPr>
+        <w:rFonts w:ascii="Symbol" w:hAnsi="Symbol" w:hint="default"/>
+        <w:sz w:val="20"/>
+      </w:rPr>
+    </w:lvl>
+    <w:lvl w:ilvl="1" w:tentative="1">
+      <w:start w:val="1"/>
+      <w:numFmt w:val="bullet"/>
+      <w:lvlText w:val="o"/>
+      <w:lvlJc w:val="left"/>
+      <w:pPr>
+        <w:tabs>
+          <w:tab w:val="num" w:pos="1440"/>
+        </w:tabs>
+        <w:ind w:left="1440" w:hanging="360"/>
+      </w:pPr>
+      <w:rPr>
+        <w:rFonts w:ascii="Courier New" w:hAnsi="Courier New" w:hint="default"/>
+        <w:sz w:val="20"/>
+      </w:rPr>
+    </w:lvl>
+    <w:lvl w:ilvl="2" w:tentative="1">
+      <w:start w:val="1"/>
+      <w:numFmt w:val="bullet"/>
+      <w:lvlText w:val=""/>
+      <w:lvlJc w:val="left"/>
+      <w:pPr>
+        <w:tabs>
+          <w:tab w:val="num" w:pos="2160"/>
+        </w:tabs>
+        <w:ind w:left="2160" w:hanging="360"/>
+      </w:pPr>
+      <w:rPr>
+        <w:rFonts w:ascii="Wingdings" w:hAnsi="Wingdings" w:hint="default"/>
+        <w:sz w:val="20"/>
+      </w:rPr>
+    </w:lvl>
+    <w:lvl w:ilvl="3" w:tentative="1">
+      <w:start w:val="1"/>
+      <w:numFmt w:val="bullet"/>
+      <w:lvlText w:val=""/>
+      <w:lvlJc w:val="left"/>
+      <w:pPr>
+        <w:tabs>
+          <w:tab w:val="num" w:pos="2880"/>
+        </w:tabs>
+        <w:ind w:left="2880" w:hanging="360"/>
+      </w:pPr>
+      <w:rPr>
+        <w:rFonts w:ascii="Wingdings" w:hAnsi="Wingdings" w:hint="default"/>
+        <w:sz w:val="20"/>
+      </w:rPr>
+    </w:lvl>
+    <w:lvl w:ilvl="4" w:tentative="1">
+      <w:start w:val="1"/>
+      <w:numFmt w:val="bullet"/>
+      <w:lvlText w:val=""/>
+      <w:lvlJc w:val="left"/>
+      <w:pPr>
+        <w:tabs>
+          <w:tab w:val="num" w:pos="3600"/>
+        </w:tabs>
+        <w:ind w:left="3600" w:hanging="360"/>
+      </w:pPr>
+      <w:rPr>
+        <w:rFonts w:ascii="Wingdings" w:hAnsi="Wingdings" w:hint="default"/>
+        <w:sz w:val="20"/>
+      </w:rPr>
+    </w:lvl>
+    <w:lvl w:ilvl="5" w:tentative="1">
+      <w:start w:val="1"/>
+      <w:numFmt w:val="bullet"/>
+      <w:lvlText w:val=""/>
+      <w:lvlJc w:val="left"/>
+      <w:pPr>
+        <w:tabs>
+          <w:tab w:val="num" w:pos="4320"/>
+        </w:tabs>
+        <w:ind w:left="4320" w:hanging="360"/>
+      </w:pPr>
+      <w:rPr>
+        <w:rFonts w:ascii="Wingdings" w:hAnsi="Wingdings" w:hint="default"/>
+        <w:sz w:val="20"/>
+      </w:rPr>
+    </w:lvl>
+    <w:lvl w:ilvl="6" w:tentative="1">
+      <w:start w:val="1"/>
+      <w:numFmt w:val="bullet"/>
+      <w:lvlText w:val=""/>
+      <w:lvlJc w:val="left"/>
+      <w:pPr>
+        <w:tabs>
+          <w:tab w:val="num" w:pos="5040"/>
+        </w:tabs>
+        <w:ind w:left="5040" w:hanging="360"/>
+      </w:pPr>
+      <w:rPr>
+        <w:rFonts w:ascii="Wingdings" w:hAnsi="Wingdings" w:hint="default"/>
+        <w:sz w:val="20"/>
+      </w:rPr>
+    </w:lvl>
+    <w:lvl w:ilvl="7" w:tentative="1">
+      <w:start w:val="1"/>
+      <w:numFmt w:val="bullet"/>
+      <w:lvlText w:val=""/>
+      <w:lvlJc w:val="left"/>
+      <w:pPr>
+        <w:tabs>
+          <w:tab w:val="num" w:pos="5760"/>
+        </w:tabs>
+        <w:ind w:left="5760" w:hanging="360"/>
+      </w:pPr>
+      <w:rPr>
+        <w:rFonts w:ascii="Wingdings" w:hAnsi="Wingdings" w:hint="default"/>
+        <w:sz w:val="20"/>
+      </w:rPr>
+    </w:lvl>
+    <w:lvl w:ilvl="8" w:tentative="1">
+      <w:start w:val="1"/>
+      <w:numFmt w:val="bullet"/>
+      <w:lvlText w:val=""/>
+      <w:lvlJc w:val="left"/>
+      <w:pPr>
+        <w:tabs>
+          <w:tab w:val="num" w:pos="6480"/>
+        </w:tabs>
+        <w:ind w:left="6480" w:hanging="360"/>
+      </w:pPr>
+      <w:rPr>
+        <w:rFonts w:ascii="Wingdings" w:hAnsi="Wingdings" w:hint="default"/>
+        <w:sz w:val="20"/>
+      </w:rPr>
+    </w:lvl>
+  </w:abstractNum>
+  <w:abstractNum w:abstractNumId="3" w15:restartNumberingAfterBreak="0">
+    <w:nsid w:val="125C10CC"/>
+    <w:multiLevelType w:val="multilevel"/>
+    <w:tmpl w:val="3F504558"/>
+    <w:lvl w:ilvl="0">
+      <w:start w:val="1"/>
+      <w:numFmt w:val="bullet"/>
+      <w:lvlText w:val=""/>
+      <w:lvlJc w:val="left"/>
+      <w:pPr>
+        <w:tabs>
+          <w:tab w:val="num" w:pos="720"/>
+        </w:tabs>
+        <w:ind w:left="720" w:hanging="360"/>
+      </w:pPr>
+      <w:rPr>
+        <w:rFonts w:ascii="Symbol" w:hAnsi="Symbol" w:hint="default"/>
+        <w:sz w:val="20"/>
+      </w:rPr>
+    </w:lvl>
+    <w:lvl w:ilvl="1" w:tentative="1">
+      <w:start w:val="1"/>
+      <w:numFmt w:val="bullet"/>
+      <w:lvlText w:val="o"/>
+      <w:lvlJc w:val="left"/>
+      <w:pPr>
+        <w:tabs>
+          <w:tab w:val="num" w:pos="1440"/>
+        </w:tabs>
+        <w:ind w:left="1440" w:hanging="360"/>
+      </w:pPr>
+      <w:rPr>
+        <w:rFonts w:ascii="Courier New" w:hAnsi="Courier New" w:hint="default"/>
+        <w:sz w:val="20"/>
+      </w:rPr>
+    </w:lvl>
+    <w:lvl w:ilvl="2" w:tentative="1">
+      <w:start w:val="1"/>
+      <w:numFmt w:val="bullet"/>
+      <w:lvlText w:val=""/>
+      <w:lvlJc w:val="left"/>
+      <w:pPr>
+        <w:tabs>
+          <w:tab w:val="num" w:pos="2160"/>
+        </w:tabs>
+        <w:ind w:left="2160" w:hanging="360"/>
+      </w:pPr>
+      <w:rPr>
+        <w:rFonts w:ascii="Wingdings" w:hAnsi="Wingdings" w:hint="default"/>
+        <w:sz w:val="20"/>
+      </w:rPr>
+    </w:lvl>
+    <w:lvl w:ilvl="3" w:tentative="1">
+      <w:start w:val="1"/>
+      <w:numFmt w:val="bullet"/>
+      <w:lvlText w:val=""/>
+      <w:lvlJc w:val="left"/>
+      <w:pPr>
+        <w:tabs>
+          <w:tab w:val="num" w:pos="2880"/>
+        </w:tabs>
+        <w:ind w:left="2880" w:hanging="360"/>
+      </w:pPr>
+      <w:rPr>
+        <w:rFonts w:ascii="Wingdings" w:hAnsi="Wingdings" w:hint="default"/>
+        <w:sz w:val="20"/>
+      </w:rPr>
+    </w:lvl>
+    <w:lvl w:ilvl="4" w:tentative="1">
+      <w:start w:val="1"/>
+      <w:numFmt w:val="bullet"/>
+      <w:lvlText w:val=""/>
+      <w:lvlJc w:val="left"/>
+      <w:pPr>
+        <w:tabs>
+          <w:tab w:val="num" w:pos="3600"/>
+        </w:tabs>
+        <w:ind w:left="3600" w:hanging="360"/>
+      </w:pPr>
+      <w:rPr>
+        <w:rFonts w:ascii="Wingdings" w:hAnsi="Wingdings" w:hint="default"/>
+        <w:sz w:val="20"/>
+      </w:rPr>
+    </w:lvl>
+    <w:lvl w:ilvl="5" w:tentative="1">
+      <w:start w:val="1"/>
+      <w:numFmt w:val="bullet"/>
+      <w:lvlText w:val=""/>
+      <w:lvlJc w:val="left"/>
+      <w:pPr>
+        <w:tabs>
+          <w:tab w:val="num" w:pos="4320"/>
+        </w:tabs>
+        <w:ind w:left="4320" w:hanging="360"/>
+      </w:pPr>
+      <w:rPr>
+        <w:rFonts w:ascii="Wingdings" w:hAnsi="Wingdings" w:hint="default"/>
+        <w:sz w:val="20"/>
+      </w:rPr>
+    </w:lvl>
+    <w:lvl w:ilvl="6" w:tentative="1">
+      <w:start w:val="1"/>
+      <w:numFmt w:val="bullet"/>
+      <w:lvlText w:val=""/>
+      <w:lvlJc w:val="left"/>
+      <w:pPr>
+        <w:tabs>
+          <w:tab w:val="num" w:pos="5040"/>
+        </w:tabs>
+        <w:ind w:left="5040" w:hanging="360"/>
+      </w:pPr>
+      <w:rPr>
+        <w:rFonts w:ascii="Wingdings" w:hAnsi="Wingdings" w:hint="default"/>
+        <w:sz w:val="20"/>
+      </w:rPr>
+    </w:lvl>
+    <w:lvl w:ilvl="7" w:tentative="1">
+      <w:start w:val="1"/>
+      <w:numFmt w:val="bullet"/>
+      <w:lvlText w:val=""/>
+      <w:lvlJc w:val="left"/>
+      <w:pPr>
+        <w:tabs>
+          <w:tab w:val="num" w:pos="5760"/>
+        </w:tabs>
+        <w:ind w:left="5760" w:hanging="360"/>
+      </w:pPr>
+      <w:rPr>
+        <w:rFonts w:ascii="Wingdings" w:hAnsi="Wingdings" w:hint="default"/>
+        <w:sz w:val="20"/>
+      </w:rPr>
+    </w:lvl>
+    <w:lvl w:ilvl="8" w:tentative="1">
+      <w:start w:val="1"/>
+      <w:numFmt w:val="bullet"/>
+      <w:lvlText w:val=""/>
+      <w:lvlJc w:val="left"/>
+      <w:pPr>
+        <w:tabs>
+          <w:tab w:val="num" w:pos="6480"/>
+        </w:tabs>
+        <w:ind w:left="6480" w:hanging="360"/>
+      </w:pPr>
+      <w:rPr>
+        <w:rFonts w:ascii="Wingdings" w:hAnsi="Wingdings" w:hint="default"/>
+        <w:sz w:val="20"/>
+      </w:rPr>
+    </w:lvl>
+  </w:abstractNum>
+  <w:abstractNum w:abstractNumId="4" w15:restartNumberingAfterBreak="0">
+    <w:nsid w:val="1B4445F5"/>
+    <w:multiLevelType w:val="multilevel"/>
+    <w:tmpl w:val="117297F6"/>
+    <w:lvl w:ilvl="0">
+      <w:start w:val="1"/>
+      <w:numFmt w:val="bullet"/>
+      <w:lvlText w:val=""/>
+      <w:lvlJc w:val="left"/>
+      <w:pPr>
+        <w:tabs>
+          <w:tab w:val="num" w:pos="720"/>
+        </w:tabs>
+        <w:ind w:left="720" w:hanging="360"/>
+      </w:pPr>
+      <w:rPr>
+        <w:rFonts w:ascii="Symbol" w:hAnsi="Symbol" w:hint="default"/>
+        <w:sz w:val="20"/>
+      </w:rPr>
+    </w:lvl>
+    <w:lvl w:ilvl="1" w:tentative="1">
+      <w:start w:val="1"/>
+      <w:numFmt w:val="bullet"/>
+      <w:lvlText w:val="o"/>
+      <w:lvlJc w:val="left"/>
+      <w:pPr>
+        <w:tabs>
+          <w:tab w:val="num" w:pos="1440"/>
+        </w:tabs>
+        <w:ind w:left="1440" w:hanging="360"/>
+      </w:pPr>
+      <w:rPr>
+        <w:rFonts w:ascii="Courier New" w:hAnsi="Courier New" w:hint="default"/>
+        <w:sz w:val="20"/>
+      </w:rPr>
+    </w:lvl>
+    <w:lvl w:ilvl="2" w:tentative="1">
+      <w:start w:val="1"/>
+      <w:numFmt w:val="bullet"/>
+      <w:lvlText w:val=""/>
+      <w:lvlJc w:val="left"/>
+      <w:pPr>
+        <w:tabs>
+          <w:tab w:val="num" w:pos="2160"/>
+        </w:tabs>
+        <w:ind w:left="2160" w:hanging="360"/>
+      </w:pPr>
+      <w:rPr>
+        <w:rFonts w:ascii="Wingdings" w:hAnsi="Wingdings" w:hint="default"/>
+        <w:sz w:val="20"/>
+      </w:rPr>
+    </w:lvl>
+    <w:lvl w:ilvl="3" w:tentative="1">
+      <w:start w:val="1"/>
+      <w:numFmt w:val="bullet"/>
+      <w:lvlText w:val=""/>
+      <w:lvlJc w:val="left"/>
+      <w:pPr>
+        <w:tabs>
+          <w:tab w:val="num" w:pos="2880"/>
+        </w:tabs>
+        <w:ind w:left="2880" w:hanging="360"/>
+      </w:pPr>
+      <w:rPr>
+        <w:rFonts w:ascii="Wingdings" w:hAnsi="Wingdings" w:hint="default"/>
+        <w:sz w:val="20"/>
+      </w:rPr>
+    </w:lvl>
+    <w:lvl w:ilvl="4" w:tentative="1">
+      <w:start w:val="1"/>
+      <w:numFmt w:val="bullet"/>
+      <w:lvlText w:val=""/>
+      <w:lvlJc w:val="left"/>
+      <w:pPr>
+        <w:tabs>
+          <w:tab w:val="num" w:pos="3600"/>
+        </w:tabs>
+        <w:ind w:left="3600" w:hanging="360"/>
+      </w:pPr>
+      <w:rPr>
+        <w:rFonts w:ascii="Wingdings" w:hAnsi="Wingdings" w:hint="default"/>
+        <w:sz w:val="20"/>
+      </w:rPr>
+    </w:lvl>
+    <w:lvl w:ilvl="5" w:tentative="1">
+      <w:start w:val="1"/>
+      <w:numFmt w:val="bullet"/>
+      <w:lvlText w:val=""/>
+      <w:lvlJc w:val="left"/>
+      <w:pPr>
+        <w:tabs>
+          <w:tab w:val="num" w:pos="4320"/>
+        </w:tabs>
+        <w:ind w:left="4320" w:hanging="360"/>
+      </w:pPr>
+      <w:rPr>
+        <w:rFonts w:ascii="Wingdings" w:hAnsi="Wingdings" w:hint="default"/>
+        <w:sz w:val="20"/>
+      </w:rPr>
+    </w:lvl>
+    <w:lvl w:ilvl="6" w:tentative="1">
+      <w:start w:val="1"/>
+      <w:numFmt w:val="bullet"/>
+      <w:lvlText w:val=""/>
+      <w:lvlJc w:val="left"/>
+      <w:pPr>
+        <w:tabs>
+          <w:tab w:val="num" w:pos="5040"/>
+        </w:tabs>
+        <w:ind w:left="5040" w:hanging="360"/>
+      </w:pPr>
+      <w:rPr>
+        <w:rFonts w:ascii="Wingdings" w:hAnsi="Wingdings" w:hint="default"/>
+        <w:sz w:val="20"/>
+      </w:rPr>
+    </w:lvl>
+    <w:lvl w:ilvl="7" w:tentative="1">
+      <w:start w:val="1"/>
+      <w:numFmt w:val="bullet"/>
+      <w:lvlText w:val=""/>
+      <w:lvlJc w:val="left"/>
+      <w:pPr>
+        <w:tabs>
+          <w:tab w:val="num" w:pos="5760"/>
+        </w:tabs>
+        <w:ind w:left="5760" w:hanging="360"/>
+      </w:pPr>
+      <w:rPr>
+        <w:rFonts w:ascii="Wingdings" w:hAnsi="Wingdings" w:hint="default"/>
+        <w:sz w:val="20"/>
+      </w:rPr>
+    </w:lvl>
+    <w:lvl w:ilvl="8" w:tentative="1">
+      <w:start w:val="1"/>
+      <w:numFmt w:val="bullet"/>
+      <w:lvlText w:val=""/>
+      <w:lvlJc w:val="left"/>
+      <w:pPr>
+        <w:tabs>
+          <w:tab w:val="num" w:pos="6480"/>
+        </w:tabs>
+        <w:ind w:left="6480" w:hanging="360"/>
+      </w:pPr>
+      <w:rPr>
+        <w:rFonts w:ascii="Wingdings" w:hAnsi="Wingdings" w:hint="default"/>
+        <w:sz w:val="20"/>
+      </w:rPr>
+    </w:lvl>
+  </w:abstractNum>
+  <w:abstractNum w:abstractNumId="5" w15:restartNumberingAfterBreak="0">
+    <w:nsid w:val="216D0670"/>
+    <w:multiLevelType w:val="multilevel"/>
+    <w:tmpl w:val="386CE1CC"/>
+    <w:lvl w:ilvl="0">
+      <w:start w:val="1"/>
+      <w:numFmt w:val="bullet"/>
+      <w:lvlText w:val=""/>
+      <w:lvlJc w:val="left"/>
+      <w:pPr>
+        <w:tabs>
+          <w:tab w:val="num" w:pos="720"/>
+        </w:tabs>
+        <w:ind w:left="720" w:hanging="360"/>
+      </w:pPr>
+      <w:rPr>
+        <w:rFonts w:ascii="Symbol" w:hAnsi="Symbol" w:hint="default"/>
+        <w:sz w:val="20"/>
+      </w:rPr>
+    </w:lvl>
+    <w:lvl w:ilvl="1" w:tentative="1">
+      <w:start w:val="1"/>
+      <w:numFmt w:val="bullet"/>
+      <w:lvlText w:val="o"/>
+      <w:lvlJc w:val="left"/>
+      <w:pPr>
+        <w:tabs>
+          <w:tab w:val="num" w:pos="1440"/>
+        </w:tabs>
+        <w:ind w:left="1440" w:hanging="360"/>
+      </w:pPr>
+      <w:rPr>
+        <w:rFonts w:ascii="Courier New" w:hAnsi="Courier New" w:hint="default"/>
+        <w:sz w:val="20"/>
+      </w:rPr>
+    </w:lvl>
+    <w:lvl w:ilvl="2" w:tentative="1">
+      <w:start w:val="1"/>
+      <w:numFmt w:val="bullet"/>
+      <w:lvlText w:val=""/>
+      <w:lvlJc w:val="left"/>
+      <w:pPr>
+        <w:tabs>
+          <w:tab w:val="num" w:pos="2160"/>
+        </w:tabs>
+        <w:ind w:left="2160" w:hanging="360"/>
+      </w:pPr>
+      <w:rPr>
+        <w:rFonts w:ascii="Wingdings" w:hAnsi="Wingdings" w:hint="default"/>
+        <w:sz w:val="20"/>
+      </w:rPr>
+    </w:lvl>
+    <w:lvl w:ilvl="3" w:tentative="1">
+      <w:start w:val="1"/>
+      <w:numFmt w:val="bullet"/>
+      <w:lvlText w:val=""/>
+      <w:lvlJc w:val="left"/>
+      <w:pPr>
+        <w:tabs>
+          <w:tab w:val="num" w:pos="2880"/>
+        </w:tabs>
+        <w:ind w:left="2880" w:hanging="360"/>
+      </w:pPr>
+      <w:rPr>
+        <w:rFonts w:ascii="Wingdings" w:hAnsi="Wingdings" w:hint="default"/>
+        <w:sz w:val="20"/>
+      </w:rPr>
+    </w:lvl>
+    <w:lvl w:ilvl="4" w:tentative="1">
+      <w:start w:val="1"/>
+      <w:numFmt w:val="bullet"/>
+      <w:lvlText w:val=""/>
+      <w:lvlJc w:val="left"/>
+      <w:pPr>
+        <w:tabs>
+          <w:tab w:val="num" w:pos="3600"/>
+        </w:tabs>
+        <w:ind w:left="3600" w:hanging="360"/>
+      </w:pPr>
+      <w:rPr>
+        <w:rFonts w:ascii="Wingdings" w:hAnsi="Wingdings" w:hint="default"/>
+        <w:sz w:val="20"/>
+      </w:rPr>
+    </w:lvl>
+    <w:lvl w:ilvl="5" w:tentative="1">
+      <w:start w:val="1"/>
+      <w:numFmt w:val="bullet"/>
+      <w:lvlText w:val=""/>
+      <w:lvlJc w:val="left"/>
+      <w:pPr>
+        <w:tabs>
+          <w:tab w:val="num" w:pos="4320"/>
+        </w:tabs>
+        <w:ind w:left="4320" w:hanging="360"/>
+      </w:pPr>
+      <w:rPr>
+        <w:rFonts w:ascii="Wingdings" w:hAnsi="Wingdings" w:hint="default"/>
+        <w:sz w:val="20"/>
+      </w:rPr>
+    </w:lvl>
+    <w:lvl w:ilvl="6" w:tentative="1">
+      <w:start w:val="1"/>
+      <w:numFmt w:val="bullet"/>
+      <w:lvlText w:val=""/>
+      <w:lvlJc w:val="left"/>
+      <w:pPr>
+        <w:tabs>
+          <w:tab w:val="num" w:pos="5040"/>
+        </w:tabs>
+        <w:ind w:left="5040" w:hanging="360"/>
+      </w:pPr>
+      <w:rPr>
+        <w:rFonts w:ascii="Wingdings" w:hAnsi="Wingdings" w:hint="default"/>
+        <w:sz w:val="20"/>
+      </w:rPr>
+    </w:lvl>
+    <w:lvl w:ilvl="7" w:tentative="1">
+      <w:start w:val="1"/>
+      <w:numFmt w:val="bullet"/>
+      <w:lvlText w:val=""/>
+      <w:lvlJc w:val="left"/>
+      <w:pPr>
+        <w:tabs>
+          <w:tab w:val="num" w:pos="5760"/>
+        </w:tabs>
+        <w:ind w:left="5760" w:hanging="360"/>
+      </w:pPr>
+      <w:rPr>
+        <w:rFonts w:ascii="Wingdings" w:hAnsi="Wingdings" w:hint="default"/>
+        <w:sz w:val="20"/>
+      </w:rPr>
+    </w:lvl>
+    <w:lvl w:ilvl="8" w:tentative="1">
+      <w:start w:val="1"/>
+      <w:numFmt w:val="bullet"/>
+      <w:lvlText w:val=""/>
+      <w:lvlJc w:val="left"/>
+      <w:pPr>
+        <w:tabs>
+          <w:tab w:val="num" w:pos="6480"/>
+        </w:tabs>
+        <w:ind w:left="6480" w:hanging="360"/>
+      </w:pPr>
+      <w:rPr>
+        <w:rFonts w:ascii="Wingdings" w:hAnsi="Wingdings" w:hint="default"/>
+        <w:sz w:val="20"/>
+      </w:rPr>
+    </w:lvl>
+  </w:abstractNum>
+  <w:abstractNum w:abstractNumId="6" w15:restartNumberingAfterBreak="0">
     <w:nsid w:val="22E84B16"/>
     <w:multiLevelType w:val="hybridMultilevel"/>
     <w:tmpl w:val="65563360"/>
@@ -3034,7 +3869,656 @@
       </w:pPr>
     </w:lvl>
   </w:abstractNum>
-  <w:abstractNum w:abstractNumId="2" w15:restartNumberingAfterBreak="0">
+  <w:abstractNum w:abstractNumId="7" w15:restartNumberingAfterBreak="0">
+    <w:nsid w:val="27E371F9"/>
+    <w:multiLevelType w:val="hybridMultilevel"/>
+    <w:tmpl w:val="CA1C4D50"/>
+    <w:lvl w:ilvl="0" w:tplc="0410000F">
+      <w:start w:val="1"/>
+      <w:numFmt w:val="decimal"/>
+      <w:lvlText w:val="%1."/>
+      <w:lvlJc w:val="left"/>
+      <w:pPr>
+        <w:ind w:left="720" w:hanging="360"/>
+      </w:pPr>
+      <w:rPr>
+        <w:rFonts w:hint="default"/>
+      </w:rPr>
+    </w:lvl>
+    <w:lvl w:ilvl="1" w:tplc="04100019" w:tentative="1">
+      <w:start w:val="1"/>
+      <w:numFmt w:val="lowerLetter"/>
+      <w:lvlText w:val="%2."/>
+      <w:lvlJc w:val="left"/>
+      <w:pPr>
+        <w:ind w:left="1440" w:hanging="360"/>
+      </w:pPr>
+    </w:lvl>
+    <w:lvl w:ilvl="2" w:tplc="0410001B" w:tentative="1">
+      <w:start w:val="1"/>
+      <w:numFmt w:val="lowerRoman"/>
+      <w:lvlText w:val="%3."/>
+      <w:lvlJc w:val="right"/>
+      <w:pPr>
+        <w:ind w:left="2160" w:hanging="180"/>
+      </w:pPr>
+    </w:lvl>
+    <w:lvl w:ilvl="3" w:tplc="0410000F" w:tentative="1">
+      <w:start w:val="1"/>
+      <w:numFmt w:val="decimal"/>
+      <w:lvlText w:val="%4."/>
+      <w:lvlJc w:val="left"/>
+      <w:pPr>
+        <w:ind w:left="2880" w:hanging="360"/>
+      </w:pPr>
+    </w:lvl>
+    <w:lvl w:ilvl="4" w:tplc="04100019" w:tentative="1">
+      <w:start w:val="1"/>
+      <w:numFmt w:val="lowerLetter"/>
+      <w:lvlText w:val="%5."/>
+      <w:lvlJc w:val="left"/>
+      <w:pPr>
+        <w:ind w:left="3600" w:hanging="360"/>
+      </w:pPr>
+    </w:lvl>
+    <w:lvl w:ilvl="5" w:tplc="0410001B" w:tentative="1">
+      <w:start w:val="1"/>
+      <w:numFmt w:val="lowerRoman"/>
+      <w:lvlText w:val="%6."/>
+      <w:lvlJc w:val="right"/>
+      <w:pPr>
+        <w:ind w:left="4320" w:hanging="180"/>
+      </w:pPr>
+    </w:lvl>
+    <w:lvl w:ilvl="6" w:tplc="0410000F" w:tentative="1">
+      <w:start w:val="1"/>
+      <w:numFmt w:val="decimal"/>
+      <w:lvlText w:val="%7."/>
+      <w:lvlJc w:val="left"/>
+      <w:pPr>
+        <w:ind w:left="5040" w:hanging="360"/>
+      </w:pPr>
+    </w:lvl>
+    <w:lvl w:ilvl="7" w:tplc="04100019" w:tentative="1">
+      <w:start w:val="1"/>
+      <w:numFmt w:val="lowerLetter"/>
+      <w:lvlText w:val="%8."/>
+      <w:lvlJc w:val="left"/>
+      <w:pPr>
+        <w:ind w:left="5760" w:hanging="360"/>
+      </w:pPr>
+    </w:lvl>
+    <w:lvl w:ilvl="8" w:tplc="0410001B" w:tentative="1">
+      <w:start w:val="1"/>
+      <w:numFmt w:val="lowerRoman"/>
+      <w:lvlText w:val="%9."/>
+      <w:lvlJc w:val="right"/>
+      <w:pPr>
+        <w:ind w:left="6480" w:hanging="180"/>
+      </w:pPr>
+    </w:lvl>
+  </w:abstractNum>
+  <w:abstractNum w:abstractNumId="8" w15:restartNumberingAfterBreak="0">
+    <w:nsid w:val="2E8864E1"/>
+    <w:multiLevelType w:val="multilevel"/>
+    <w:tmpl w:val="8E9EA99C"/>
+    <w:lvl w:ilvl="0">
+      <w:start w:val="1"/>
+      <w:numFmt w:val="bullet"/>
+      <w:lvlText w:val=""/>
+      <w:lvlJc w:val="left"/>
+      <w:pPr>
+        <w:tabs>
+          <w:tab w:val="num" w:pos="720"/>
+        </w:tabs>
+        <w:ind w:left="720" w:hanging="360"/>
+      </w:pPr>
+      <w:rPr>
+        <w:rFonts w:ascii="Symbol" w:hAnsi="Symbol" w:hint="default"/>
+        <w:sz w:val="20"/>
+      </w:rPr>
+    </w:lvl>
+    <w:lvl w:ilvl="1" w:tentative="1">
+      <w:start w:val="1"/>
+      <w:numFmt w:val="bullet"/>
+      <w:lvlText w:val="o"/>
+      <w:lvlJc w:val="left"/>
+      <w:pPr>
+        <w:tabs>
+          <w:tab w:val="num" w:pos="1440"/>
+        </w:tabs>
+        <w:ind w:left="1440" w:hanging="360"/>
+      </w:pPr>
+      <w:rPr>
+        <w:rFonts w:ascii="Courier New" w:hAnsi="Courier New" w:hint="default"/>
+        <w:sz w:val="20"/>
+      </w:rPr>
+    </w:lvl>
+    <w:lvl w:ilvl="2" w:tentative="1">
+      <w:start w:val="1"/>
+      <w:numFmt w:val="bullet"/>
+      <w:lvlText w:val=""/>
+      <w:lvlJc w:val="left"/>
+      <w:pPr>
+        <w:tabs>
+          <w:tab w:val="num" w:pos="2160"/>
+        </w:tabs>
+        <w:ind w:left="2160" w:hanging="360"/>
+      </w:pPr>
+      <w:rPr>
+        <w:rFonts w:ascii="Wingdings" w:hAnsi="Wingdings" w:hint="default"/>
+        <w:sz w:val="20"/>
+      </w:rPr>
+    </w:lvl>
+    <w:lvl w:ilvl="3" w:tentative="1">
+      <w:start w:val="1"/>
+      <w:numFmt w:val="bullet"/>
+      <w:lvlText w:val=""/>
+      <w:lvlJc w:val="left"/>
+      <w:pPr>
+        <w:tabs>
+          <w:tab w:val="num" w:pos="2880"/>
+        </w:tabs>
+        <w:ind w:left="2880" w:hanging="360"/>
+      </w:pPr>
+      <w:rPr>
+        <w:rFonts w:ascii="Wingdings" w:hAnsi="Wingdings" w:hint="default"/>
+        <w:sz w:val="20"/>
+      </w:rPr>
+    </w:lvl>
+    <w:lvl w:ilvl="4" w:tentative="1">
+      <w:start w:val="1"/>
+      <w:numFmt w:val="bullet"/>
+      <w:lvlText w:val=""/>
+      <w:lvlJc w:val="left"/>
+      <w:pPr>
+        <w:tabs>
+          <w:tab w:val="num" w:pos="3600"/>
+        </w:tabs>
+        <w:ind w:left="3600" w:hanging="360"/>
+      </w:pPr>
+      <w:rPr>
+        <w:rFonts w:ascii="Wingdings" w:hAnsi="Wingdings" w:hint="default"/>
+        <w:sz w:val="20"/>
+      </w:rPr>
+    </w:lvl>
+    <w:lvl w:ilvl="5" w:tentative="1">
+      <w:start w:val="1"/>
+      <w:numFmt w:val="bullet"/>
+      <w:lvlText w:val=""/>
+      <w:lvlJc w:val="left"/>
+      <w:pPr>
+        <w:tabs>
+          <w:tab w:val="num" w:pos="4320"/>
+        </w:tabs>
+        <w:ind w:left="4320" w:hanging="360"/>
+      </w:pPr>
+      <w:rPr>
+        <w:rFonts w:ascii="Wingdings" w:hAnsi="Wingdings" w:hint="default"/>
+        <w:sz w:val="20"/>
+      </w:rPr>
+    </w:lvl>
+    <w:lvl w:ilvl="6" w:tentative="1">
+      <w:start w:val="1"/>
+      <w:numFmt w:val="bullet"/>
+      <w:lvlText w:val=""/>
+      <w:lvlJc w:val="left"/>
+      <w:pPr>
+        <w:tabs>
+          <w:tab w:val="num" w:pos="5040"/>
+        </w:tabs>
+        <w:ind w:left="5040" w:hanging="360"/>
+      </w:pPr>
+      <w:rPr>
+        <w:rFonts w:ascii="Wingdings" w:hAnsi="Wingdings" w:hint="default"/>
+        <w:sz w:val="20"/>
+      </w:rPr>
+    </w:lvl>
+    <w:lvl w:ilvl="7" w:tentative="1">
+      <w:start w:val="1"/>
+      <w:numFmt w:val="bullet"/>
+      <w:lvlText w:val=""/>
+      <w:lvlJc w:val="left"/>
+      <w:pPr>
+        <w:tabs>
+          <w:tab w:val="num" w:pos="5760"/>
+        </w:tabs>
+        <w:ind w:left="5760" w:hanging="360"/>
+      </w:pPr>
+      <w:rPr>
+        <w:rFonts w:ascii="Wingdings" w:hAnsi="Wingdings" w:hint="default"/>
+        <w:sz w:val="20"/>
+      </w:rPr>
+    </w:lvl>
+    <w:lvl w:ilvl="8" w:tentative="1">
+      <w:start w:val="1"/>
+      <w:numFmt w:val="bullet"/>
+      <w:lvlText w:val=""/>
+      <w:lvlJc w:val="left"/>
+      <w:pPr>
+        <w:tabs>
+          <w:tab w:val="num" w:pos="6480"/>
+        </w:tabs>
+        <w:ind w:left="6480" w:hanging="360"/>
+      </w:pPr>
+      <w:rPr>
+        <w:rFonts w:ascii="Wingdings" w:hAnsi="Wingdings" w:hint="default"/>
+        <w:sz w:val="20"/>
+      </w:rPr>
+    </w:lvl>
+  </w:abstractNum>
+  <w:abstractNum w:abstractNumId="9" w15:restartNumberingAfterBreak="0">
+    <w:nsid w:val="32CA20D1"/>
+    <w:multiLevelType w:val="multilevel"/>
+    <w:tmpl w:val="6D303CEE"/>
+    <w:lvl w:ilvl="0">
+      <w:start w:val="1"/>
+      <w:numFmt w:val="bullet"/>
+      <w:lvlText w:val=""/>
+      <w:lvlJc w:val="left"/>
+      <w:pPr>
+        <w:tabs>
+          <w:tab w:val="num" w:pos="720"/>
+        </w:tabs>
+        <w:ind w:left="720" w:hanging="360"/>
+      </w:pPr>
+      <w:rPr>
+        <w:rFonts w:ascii="Symbol" w:hAnsi="Symbol" w:hint="default"/>
+        <w:sz w:val="20"/>
+      </w:rPr>
+    </w:lvl>
+    <w:lvl w:ilvl="1" w:tentative="1">
+      <w:start w:val="1"/>
+      <w:numFmt w:val="bullet"/>
+      <w:lvlText w:val="o"/>
+      <w:lvlJc w:val="left"/>
+      <w:pPr>
+        <w:tabs>
+          <w:tab w:val="num" w:pos="1440"/>
+        </w:tabs>
+        <w:ind w:left="1440" w:hanging="360"/>
+      </w:pPr>
+      <w:rPr>
+        <w:rFonts w:ascii="Courier New" w:hAnsi="Courier New" w:hint="default"/>
+        <w:sz w:val="20"/>
+      </w:rPr>
+    </w:lvl>
+    <w:lvl w:ilvl="2" w:tentative="1">
+      <w:start w:val="1"/>
+      <w:numFmt w:val="bullet"/>
+      <w:lvlText w:val=""/>
+      <w:lvlJc w:val="left"/>
+      <w:pPr>
+        <w:tabs>
+          <w:tab w:val="num" w:pos="2160"/>
+        </w:tabs>
+        <w:ind w:left="2160" w:hanging="360"/>
+      </w:pPr>
+      <w:rPr>
+        <w:rFonts w:ascii="Wingdings" w:hAnsi="Wingdings" w:hint="default"/>
+        <w:sz w:val="20"/>
+      </w:rPr>
+    </w:lvl>
+    <w:lvl w:ilvl="3" w:tentative="1">
+      <w:start w:val="1"/>
+      <w:numFmt w:val="bullet"/>
+      <w:lvlText w:val=""/>
+      <w:lvlJc w:val="left"/>
+      <w:pPr>
+        <w:tabs>
+          <w:tab w:val="num" w:pos="2880"/>
+        </w:tabs>
+        <w:ind w:left="2880" w:hanging="360"/>
+      </w:pPr>
+      <w:rPr>
+        <w:rFonts w:ascii="Wingdings" w:hAnsi="Wingdings" w:hint="default"/>
+        <w:sz w:val="20"/>
+      </w:rPr>
+    </w:lvl>
+    <w:lvl w:ilvl="4" w:tentative="1">
+      <w:start w:val="1"/>
+      <w:numFmt w:val="bullet"/>
+      <w:lvlText w:val=""/>
+      <w:lvlJc w:val="left"/>
+      <w:pPr>
+        <w:tabs>
+          <w:tab w:val="num" w:pos="3600"/>
+        </w:tabs>
+        <w:ind w:left="3600" w:hanging="360"/>
+      </w:pPr>
+      <w:rPr>
+        <w:rFonts w:ascii="Wingdings" w:hAnsi="Wingdings" w:hint="default"/>
+        <w:sz w:val="20"/>
+      </w:rPr>
+    </w:lvl>
+    <w:lvl w:ilvl="5" w:tentative="1">
+      <w:start w:val="1"/>
+      <w:numFmt w:val="bullet"/>
+      <w:lvlText w:val=""/>
+      <w:lvlJc w:val="left"/>
+      <w:pPr>
+        <w:tabs>
+          <w:tab w:val="num" w:pos="4320"/>
+        </w:tabs>
+        <w:ind w:left="4320" w:hanging="360"/>
+      </w:pPr>
+      <w:rPr>
+        <w:rFonts w:ascii="Wingdings" w:hAnsi="Wingdings" w:hint="default"/>
+        <w:sz w:val="20"/>
+      </w:rPr>
+    </w:lvl>
+    <w:lvl w:ilvl="6" w:tentative="1">
+      <w:start w:val="1"/>
+      <w:numFmt w:val="bullet"/>
+      <w:lvlText w:val=""/>
+      <w:lvlJc w:val="left"/>
+      <w:pPr>
+        <w:tabs>
+          <w:tab w:val="num" w:pos="5040"/>
+        </w:tabs>
+        <w:ind w:left="5040" w:hanging="360"/>
+      </w:pPr>
+      <w:rPr>
+        <w:rFonts w:ascii="Wingdings" w:hAnsi="Wingdings" w:hint="default"/>
+        <w:sz w:val="20"/>
+      </w:rPr>
+    </w:lvl>
+    <w:lvl w:ilvl="7" w:tentative="1">
+      <w:start w:val="1"/>
+      <w:numFmt w:val="bullet"/>
+      <w:lvlText w:val=""/>
+      <w:lvlJc w:val="left"/>
+      <w:pPr>
+        <w:tabs>
+          <w:tab w:val="num" w:pos="5760"/>
+        </w:tabs>
+        <w:ind w:left="5760" w:hanging="360"/>
+      </w:pPr>
+      <w:rPr>
+        <w:rFonts w:ascii="Wingdings" w:hAnsi="Wingdings" w:hint="default"/>
+        <w:sz w:val="20"/>
+      </w:rPr>
+    </w:lvl>
+    <w:lvl w:ilvl="8" w:tentative="1">
+      <w:start w:val="1"/>
+      <w:numFmt w:val="bullet"/>
+      <w:lvlText w:val=""/>
+      <w:lvlJc w:val="left"/>
+      <w:pPr>
+        <w:tabs>
+          <w:tab w:val="num" w:pos="6480"/>
+        </w:tabs>
+        <w:ind w:left="6480" w:hanging="360"/>
+      </w:pPr>
+      <w:rPr>
+        <w:rFonts w:ascii="Wingdings" w:hAnsi="Wingdings" w:hint="default"/>
+        <w:sz w:val="20"/>
+      </w:rPr>
+    </w:lvl>
+  </w:abstractNum>
+  <w:abstractNum w:abstractNumId="10" w15:restartNumberingAfterBreak="0">
+    <w:nsid w:val="3DC72C77"/>
+    <w:multiLevelType w:val="multilevel"/>
+    <w:tmpl w:val="06CC0A42"/>
+    <w:lvl w:ilvl="0">
+      <w:start w:val="1"/>
+      <w:numFmt w:val="bullet"/>
+      <w:lvlText w:val=""/>
+      <w:lvlJc w:val="left"/>
+      <w:pPr>
+        <w:tabs>
+          <w:tab w:val="num" w:pos="720"/>
+        </w:tabs>
+        <w:ind w:left="720" w:hanging="360"/>
+      </w:pPr>
+      <w:rPr>
+        <w:rFonts w:ascii="Symbol" w:hAnsi="Symbol" w:hint="default"/>
+        <w:sz w:val="20"/>
+      </w:rPr>
+    </w:lvl>
+    <w:lvl w:ilvl="1" w:tentative="1">
+      <w:start w:val="1"/>
+      <w:numFmt w:val="bullet"/>
+      <w:lvlText w:val="o"/>
+      <w:lvlJc w:val="left"/>
+      <w:pPr>
+        <w:tabs>
+          <w:tab w:val="num" w:pos="1440"/>
+        </w:tabs>
+        <w:ind w:left="1440" w:hanging="360"/>
+      </w:pPr>
+      <w:rPr>
+        <w:rFonts w:ascii="Courier New" w:hAnsi="Courier New" w:hint="default"/>
+        <w:sz w:val="20"/>
+      </w:rPr>
+    </w:lvl>
+    <w:lvl w:ilvl="2" w:tentative="1">
+      <w:start w:val="1"/>
+      <w:numFmt w:val="bullet"/>
+      <w:lvlText w:val=""/>
+      <w:lvlJc w:val="left"/>
+      <w:pPr>
+        <w:tabs>
+          <w:tab w:val="num" w:pos="2160"/>
+        </w:tabs>
+        <w:ind w:left="2160" w:hanging="360"/>
+      </w:pPr>
+      <w:rPr>
+        <w:rFonts w:ascii="Wingdings" w:hAnsi="Wingdings" w:hint="default"/>
+        <w:sz w:val="20"/>
+      </w:rPr>
+    </w:lvl>
+    <w:lvl w:ilvl="3" w:tentative="1">
+      <w:start w:val="1"/>
+      <w:numFmt w:val="bullet"/>
+      <w:lvlText w:val=""/>
+      <w:lvlJc w:val="left"/>
+      <w:pPr>
+        <w:tabs>
+          <w:tab w:val="num" w:pos="2880"/>
+        </w:tabs>
+        <w:ind w:left="2880" w:hanging="360"/>
+      </w:pPr>
+      <w:rPr>
+        <w:rFonts w:ascii="Wingdings" w:hAnsi="Wingdings" w:hint="default"/>
+        <w:sz w:val="20"/>
+      </w:rPr>
+    </w:lvl>
+    <w:lvl w:ilvl="4" w:tentative="1">
+      <w:start w:val="1"/>
+      <w:numFmt w:val="bullet"/>
+      <w:lvlText w:val=""/>
+      <w:lvlJc w:val="left"/>
+      <w:pPr>
+        <w:tabs>
+          <w:tab w:val="num" w:pos="3600"/>
+        </w:tabs>
+        <w:ind w:left="3600" w:hanging="360"/>
+      </w:pPr>
+      <w:rPr>
+        <w:rFonts w:ascii="Wingdings" w:hAnsi="Wingdings" w:hint="default"/>
+        <w:sz w:val="20"/>
+      </w:rPr>
+    </w:lvl>
+    <w:lvl w:ilvl="5" w:tentative="1">
+      <w:start w:val="1"/>
+      <w:numFmt w:val="bullet"/>
+      <w:lvlText w:val=""/>
+      <w:lvlJc w:val="left"/>
+      <w:pPr>
+        <w:tabs>
+          <w:tab w:val="num" w:pos="4320"/>
+        </w:tabs>
+        <w:ind w:left="4320" w:hanging="360"/>
+      </w:pPr>
+      <w:rPr>
+        <w:rFonts w:ascii="Wingdings" w:hAnsi="Wingdings" w:hint="default"/>
+        <w:sz w:val="20"/>
+      </w:rPr>
+    </w:lvl>
+    <w:lvl w:ilvl="6" w:tentative="1">
+      <w:start w:val="1"/>
+      <w:numFmt w:val="bullet"/>
+      <w:lvlText w:val=""/>
+      <w:lvlJc w:val="left"/>
+      <w:pPr>
+        <w:tabs>
+          <w:tab w:val="num" w:pos="5040"/>
+        </w:tabs>
+        <w:ind w:left="5040" w:hanging="360"/>
+      </w:pPr>
+      <w:rPr>
+        <w:rFonts w:ascii="Wingdings" w:hAnsi="Wingdings" w:hint="default"/>
+        <w:sz w:val="20"/>
+      </w:rPr>
+    </w:lvl>
+    <w:lvl w:ilvl="7" w:tentative="1">
+      <w:start w:val="1"/>
+      <w:numFmt w:val="bullet"/>
+      <w:lvlText w:val=""/>
+      <w:lvlJc w:val="left"/>
+      <w:pPr>
+        <w:tabs>
+          <w:tab w:val="num" w:pos="5760"/>
+        </w:tabs>
+        <w:ind w:left="5760" w:hanging="360"/>
+      </w:pPr>
+      <w:rPr>
+        <w:rFonts w:ascii="Wingdings" w:hAnsi="Wingdings" w:hint="default"/>
+        <w:sz w:val="20"/>
+      </w:rPr>
+    </w:lvl>
+    <w:lvl w:ilvl="8" w:tentative="1">
+      <w:start w:val="1"/>
+      <w:numFmt w:val="bullet"/>
+      <w:lvlText w:val=""/>
+      <w:lvlJc w:val="left"/>
+      <w:pPr>
+        <w:tabs>
+          <w:tab w:val="num" w:pos="6480"/>
+        </w:tabs>
+        <w:ind w:left="6480" w:hanging="360"/>
+      </w:pPr>
+      <w:rPr>
+        <w:rFonts w:ascii="Wingdings" w:hAnsi="Wingdings" w:hint="default"/>
+        <w:sz w:val="20"/>
+      </w:rPr>
+    </w:lvl>
+  </w:abstractNum>
+  <w:abstractNum w:abstractNumId="11" w15:restartNumberingAfterBreak="0">
+    <w:nsid w:val="3E754F8F"/>
+    <w:multiLevelType w:val="multilevel"/>
+    <w:tmpl w:val="E34A1000"/>
+    <w:lvl w:ilvl="0">
+      <w:start w:val="1"/>
+      <w:numFmt w:val="decimal"/>
+      <w:lvlText w:val="%1."/>
+      <w:lvlJc w:val="left"/>
+      <w:pPr>
+        <w:tabs>
+          <w:tab w:val="num" w:pos="720"/>
+        </w:tabs>
+        <w:ind w:left="720" w:hanging="360"/>
+      </w:pPr>
+    </w:lvl>
+    <w:lvl w:ilvl="1" w:tentative="1">
+      <w:start w:val="1"/>
+      <w:numFmt w:val="decimal"/>
+      <w:lvlText w:val="%2."/>
+      <w:lvlJc w:val="left"/>
+      <w:pPr>
+        <w:tabs>
+          <w:tab w:val="num" w:pos="1440"/>
+        </w:tabs>
+        <w:ind w:left="1440" w:hanging="360"/>
+      </w:pPr>
+    </w:lvl>
+    <w:lvl w:ilvl="2" w:tentative="1">
+      <w:start w:val="1"/>
+      <w:numFmt w:val="decimal"/>
+      <w:lvlText w:val="%3."/>
+      <w:lvlJc w:val="left"/>
+      <w:pPr>
+        <w:tabs>
+          <w:tab w:val="num" w:pos="2160"/>
+        </w:tabs>
+        <w:ind w:left="2160" w:hanging="360"/>
+      </w:pPr>
+    </w:lvl>
+    <w:lvl w:ilvl="3" w:tentative="1">
+      <w:start w:val="1"/>
+      <w:numFmt w:val="decimal"/>
+      <w:lvlText w:val="%4."/>
+      <w:lvlJc w:val="left"/>
+      <w:pPr>
+        <w:tabs>
+          <w:tab w:val="num" w:pos="2880"/>
+        </w:tabs>
+        <w:ind w:left="2880" w:hanging="360"/>
+      </w:pPr>
+    </w:lvl>
+    <w:lvl w:ilvl="4" w:tentative="1">
+      <w:start w:val="1"/>
+      <w:numFmt w:val="decimal"/>
+      <w:lvlText w:val="%5."/>
+      <w:lvlJc w:val="left"/>
+      <w:pPr>
+        <w:tabs>
+          <w:tab w:val="num" w:pos="3600"/>
+        </w:tabs>
+        <w:ind w:left="3600" w:hanging="360"/>
+      </w:pPr>
+    </w:lvl>
+    <w:lvl w:ilvl="5" w:tentative="1">
+      <w:start w:val="1"/>
+      <w:numFmt w:val="decimal"/>
+      <w:lvlText w:val="%6."/>
+      <w:lvlJc w:val="left"/>
+      <w:pPr>
+        <w:tabs>
+          <w:tab w:val="num" w:pos="4320"/>
+        </w:tabs>
+        <w:ind w:left="4320" w:hanging="360"/>
+      </w:pPr>
+    </w:lvl>
+    <w:lvl w:ilvl="6" w:tentative="1">
+      <w:start w:val="1"/>
+      <w:numFmt w:val="decimal"/>
+      <w:lvlText w:val="%7."/>
+      <w:lvlJc w:val="left"/>
+      <w:pPr>
+        <w:tabs>
+          <w:tab w:val="num" w:pos="5040"/>
+        </w:tabs>
+        <w:ind w:left="5040" w:hanging="360"/>
+      </w:pPr>
+    </w:lvl>
+    <w:lvl w:ilvl="7" w:tentative="1">
+      <w:start w:val="1"/>
+      <w:numFmt w:val="decimal"/>
+      <w:lvlText w:val="%8."/>
+      <w:lvlJc w:val="left"/>
+      <w:pPr>
+        <w:tabs>
+          <w:tab w:val="num" w:pos="5760"/>
+        </w:tabs>
+        <w:ind w:left="5760" w:hanging="360"/>
+      </w:pPr>
+    </w:lvl>
+    <w:lvl w:ilvl="8" w:tentative="1">
+      <w:start w:val="1"/>
+      <w:numFmt w:val="decimal"/>
+      <w:lvlText w:val="%9."/>
+      <w:lvlJc w:val="left"/>
+      <w:pPr>
+        <w:tabs>
+          <w:tab w:val="num" w:pos="6480"/>
+        </w:tabs>
+        <w:ind w:left="6480" w:hanging="360"/>
+      </w:pPr>
+    </w:lvl>
+  </w:abstractNum>
+  <w:abstractNum w:abstractNumId="12" w15:restartNumberingAfterBreak="0">
     <w:nsid w:val="43640ED8"/>
     <w:multiLevelType w:val="hybridMultilevel"/>
     <w:tmpl w:val="C5FAB8BE"/>
@@ -3146,7 +4630,156 @@
       </w:rPr>
     </w:lvl>
   </w:abstractNum>
-  <w:abstractNum w:abstractNumId="3" w15:restartNumberingAfterBreak="0">
+  <w:abstractNum w:abstractNumId="13" w15:restartNumberingAfterBreak="0">
+    <w:nsid w:val="4CF46647"/>
+    <w:multiLevelType w:val="multilevel"/>
+    <w:tmpl w:val="193C91CC"/>
+    <w:lvl w:ilvl="0">
+      <w:start w:val="1"/>
+      <w:numFmt w:val="bullet"/>
+      <w:lvlText w:val=""/>
+      <w:lvlJc w:val="left"/>
+      <w:pPr>
+        <w:tabs>
+          <w:tab w:val="num" w:pos="720"/>
+        </w:tabs>
+        <w:ind w:left="720" w:hanging="360"/>
+      </w:pPr>
+      <w:rPr>
+        <w:rFonts w:ascii="Symbol" w:hAnsi="Symbol" w:hint="default"/>
+        <w:sz w:val="20"/>
+      </w:rPr>
+    </w:lvl>
+    <w:lvl w:ilvl="1" w:tentative="1">
+      <w:start w:val="1"/>
+      <w:numFmt w:val="bullet"/>
+      <w:lvlText w:val="o"/>
+      <w:lvlJc w:val="left"/>
+      <w:pPr>
+        <w:tabs>
+          <w:tab w:val="num" w:pos="1440"/>
+        </w:tabs>
+        <w:ind w:left="1440" w:hanging="360"/>
+      </w:pPr>
+      <w:rPr>
+        <w:rFonts w:ascii="Courier New" w:hAnsi="Courier New" w:hint="default"/>
+        <w:sz w:val="20"/>
+      </w:rPr>
+    </w:lvl>
+    <w:lvl w:ilvl="2" w:tentative="1">
+      <w:start w:val="1"/>
+      <w:numFmt w:val="bullet"/>
+      <w:lvlText w:val=""/>
+      <w:lvlJc w:val="left"/>
+      <w:pPr>
+        <w:tabs>
+          <w:tab w:val="num" w:pos="2160"/>
+        </w:tabs>
+        <w:ind w:left="2160" w:hanging="360"/>
+      </w:pPr>
+      <w:rPr>
+        <w:rFonts w:ascii="Wingdings" w:hAnsi="Wingdings" w:hint="default"/>
+        <w:sz w:val="20"/>
+      </w:rPr>
+    </w:lvl>
+    <w:lvl w:ilvl="3" w:tentative="1">
+      <w:start w:val="1"/>
+      <w:numFmt w:val="bullet"/>
+      <w:lvlText w:val=""/>
+      <w:lvlJc w:val="left"/>
+      <w:pPr>
+        <w:tabs>
+          <w:tab w:val="num" w:pos="2880"/>
+        </w:tabs>
+        <w:ind w:left="2880" w:hanging="360"/>
+      </w:pPr>
+      <w:rPr>
+        <w:rFonts w:ascii="Wingdings" w:hAnsi="Wingdings" w:hint="default"/>
+        <w:sz w:val="20"/>
+      </w:rPr>
+    </w:lvl>
+    <w:lvl w:ilvl="4" w:tentative="1">
+      <w:start w:val="1"/>
+      <w:numFmt w:val="bullet"/>
+      <w:lvlText w:val=""/>
+      <w:lvlJc w:val="left"/>
+      <w:pPr>
+        <w:tabs>
+          <w:tab w:val="num" w:pos="3600"/>
+        </w:tabs>
+        <w:ind w:left="3600" w:hanging="360"/>
+      </w:pPr>
+      <w:rPr>
+        <w:rFonts w:ascii="Wingdings" w:hAnsi="Wingdings" w:hint="default"/>
+        <w:sz w:val="20"/>
+      </w:rPr>
+    </w:lvl>
+    <w:lvl w:ilvl="5" w:tentative="1">
+      <w:start w:val="1"/>
+      <w:numFmt w:val="bullet"/>
+      <w:lvlText w:val=""/>
+      <w:lvlJc w:val="left"/>
+      <w:pPr>
+        <w:tabs>
+          <w:tab w:val="num" w:pos="4320"/>
+        </w:tabs>
+        <w:ind w:left="4320" w:hanging="360"/>
+      </w:pPr>
+      <w:rPr>
+        <w:rFonts w:ascii="Wingdings" w:hAnsi="Wingdings" w:hint="default"/>
+        <w:sz w:val="20"/>
+      </w:rPr>
+    </w:lvl>
+    <w:lvl w:ilvl="6" w:tentative="1">
+      <w:start w:val="1"/>
+      <w:numFmt w:val="bullet"/>
+      <w:lvlText w:val=""/>
+      <w:lvlJc w:val="left"/>
+      <w:pPr>
+        <w:tabs>
+          <w:tab w:val="num" w:pos="5040"/>
+        </w:tabs>
+        <w:ind w:left="5040" w:hanging="360"/>
+      </w:pPr>
+      <w:rPr>
+        <w:rFonts w:ascii="Wingdings" w:hAnsi="Wingdings" w:hint="default"/>
+        <w:sz w:val="20"/>
+      </w:rPr>
+    </w:lvl>
+    <w:lvl w:ilvl="7" w:tentative="1">
+      <w:start w:val="1"/>
+      <w:numFmt w:val="bullet"/>
+      <w:lvlText w:val=""/>
+      <w:lvlJc w:val="left"/>
+      <w:pPr>
+        <w:tabs>
+          <w:tab w:val="num" w:pos="5760"/>
+        </w:tabs>
+        <w:ind w:left="5760" w:hanging="360"/>
+      </w:pPr>
+      <w:rPr>
+        <w:rFonts w:ascii="Wingdings" w:hAnsi="Wingdings" w:hint="default"/>
+        <w:sz w:val="20"/>
+      </w:rPr>
+    </w:lvl>
+    <w:lvl w:ilvl="8" w:tentative="1">
+      <w:start w:val="1"/>
+      <w:numFmt w:val="bullet"/>
+      <w:lvlText w:val=""/>
+      <w:lvlJc w:val="left"/>
+      <w:pPr>
+        <w:tabs>
+          <w:tab w:val="num" w:pos="6480"/>
+        </w:tabs>
+        <w:ind w:left="6480" w:hanging="360"/>
+      </w:pPr>
+      <w:rPr>
+        <w:rFonts w:ascii="Wingdings" w:hAnsi="Wingdings" w:hint="default"/>
+        <w:sz w:val="20"/>
+      </w:rPr>
+    </w:lvl>
+  </w:abstractNum>
+  <w:abstractNum w:abstractNumId="14" w15:restartNumberingAfterBreak="0">
     <w:nsid w:val="4DD4725C"/>
     <w:multiLevelType w:val="hybridMultilevel"/>
     <w:tmpl w:val="6E6C99FE"/>
@@ -3235,7 +4868,454 @@
       </w:pPr>
     </w:lvl>
   </w:abstractNum>
-  <w:abstractNum w:abstractNumId="4" w15:restartNumberingAfterBreak="0">
+  <w:abstractNum w:abstractNumId="15" w15:restartNumberingAfterBreak="0">
+    <w:nsid w:val="525430CC"/>
+    <w:multiLevelType w:val="multilevel"/>
+    <w:tmpl w:val="99D06604"/>
+    <w:lvl w:ilvl="0">
+      <w:start w:val="1"/>
+      <w:numFmt w:val="bullet"/>
+      <w:lvlText w:val=""/>
+      <w:lvlJc w:val="left"/>
+      <w:pPr>
+        <w:tabs>
+          <w:tab w:val="num" w:pos="720"/>
+        </w:tabs>
+        <w:ind w:left="720" w:hanging="360"/>
+      </w:pPr>
+      <w:rPr>
+        <w:rFonts w:ascii="Symbol" w:hAnsi="Symbol" w:hint="default"/>
+        <w:sz w:val="20"/>
+      </w:rPr>
+    </w:lvl>
+    <w:lvl w:ilvl="1" w:tentative="1">
+      <w:start w:val="1"/>
+      <w:numFmt w:val="bullet"/>
+      <w:lvlText w:val="o"/>
+      <w:lvlJc w:val="left"/>
+      <w:pPr>
+        <w:tabs>
+          <w:tab w:val="num" w:pos="1440"/>
+        </w:tabs>
+        <w:ind w:left="1440" w:hanging="360"/>
+      </w:pPr>
+      <w:rPr>
+        <w:rFonts w:ascii="Courier New" w:hAnsi="Courier New" w:hint="default"/>
+        <w:sz w:val="20"/>
+      </w:rPr>
+    </w:lvl>
+    <w:lvl w:ilvl="2" w:tentative="1">
+      <w:start w:val="1"/>
+      <w:numFmt w:val="bullet"/>
+      <w:lvlText w:val=""/>
+      <w:lvlJc w:val="left"/>
+      <w:pPr>
+        <w:tabs>
+          <w:tab w:val="num" w:pos="2160"/>
+        </w:tabs>
+        <w:ind w:left="2160" w:hanging="360"/>
+      </w:pPr>
+      <w:rPr>
+        <w:rFonts w:ascii="Wingdings" w:hAnsi="Wingdings" w:hint="default"/>
+        <w:sz w:val="20"/>
+      </w:rPr>
+    </w:lvl>
+    <w:lvl w:ilvl="3" w:tentative="1">
+      <w:start w:val="1"/>
+      <w:numFmt w:val="bullet"/>
+      <w:lvlText w:val=""/>
+      <w:lvlJc w:val="left"/>
+      <w:pPr>
+        <w:tabs>
+          <w:tab w:val="num" w:pos="2880"/>
+        </w:tabs>
+        <w:ind w:left="2880" w:hanging="360"/>
+      </w:pPr>
+      <w:rPr>
+        <w:rFonts w:ascii="Wingdings" w:hAnsi="Wingdings" w:hint="default"/>
+        <w:sz w:val="20"/>
+      </w:rPr>
+    </w:lvl>
+    <w:lvl w:ilvl="4" w:tentative="1">
+      <w:start w:val="1"/>
+      <w:numFmt w:val="bullet"/>
+      <w:lvlText w:val=""/>
+      <w:lvlJc w:val="left"/>
+      <w:pPr>
+        <w:tabs>
+          <w:tab w:val="num" w:pos="3600"/>
+        </w:tabs>
+        <w:ind w:left="3600" w:hanging="360"/>
+      </w:pPr>
+      <w:rPr>
+        <w:rFonts w:ascii="Wingdings" w:hAnsi="Wingdings" w:hint="default"/>
+        <w:sz w:val="20"/>
+      </w:rPr>
+    </w:lvl>
+    <w:lvl w:ilvl="5" w:tentative="1">
+      <w:start w:val="1"/>
+      <w:numFmt w:val="bullet"/>
+      <w:lvlText w:val=""/>
+      <w:lvlJc w:val="left"/>
+      <w:pPr>
+        <w:tabs>
+          <w:tab w:val="num" w:pos="4320"/>
+        </w:tabs>
+        <w:ind w:left="4320" w:hanging="360"/>
+      </w:pPr>
+      <w:rPr>
+        <w:rFonts w:ascii="Wingdings" w:hAnsi="Wingdings" w:hint="default"/>
+        <w:sz w:val="20"/>
+      </w:rPr>
+    </w:lvl>
+    <w:lvl w:ilvl="6" w:tentative="1">
+      <w:start w:val="1"/>
+      <w:numFmt w:val="bullet"/>
+      <w:lvlText w:val=""/>
+      <w:lvlJc w:val="left"/>
+      <w:pPr>
+        <w:tabs>
+          <w:tab w:val="num" w:pos="5040"/>
+        </w:tabs>
+        <w:ind w:left="5040" w:hanging="360"/>
+      </w:pPr>
+      <w:rPr>
+        <w:rFonts w:ascii="Wingdings" w:hAnsi="Wingdings" w:hint="default"/>
+        <w:sz w:val="20"/>
+      </w:rPr>
+    </w:lvl>
+    <w:lvl w:ilvl="7" w:tentative="1">
+      <w:start w:val="1"/>
+      <w:numFmt w:val="bullet"/>
+      <w:lvlText w:val=""/>
+      <w:lvlJc w:val="left"/>
+      <w:pPr>
+        <w:tabs>
+          <w:tab w:val="num" w:pos="5760"/>
+        </w:tabs>
+        <w:ind w:left="5760" w:hanging="360"/>
+      </w:pPr>
+      <w:rPr>
+        <w:rFonts w:ascii="Wingdings" w:hAnsi="Wingdings" w:hint="default"/>
+        <w:sz w:val="20"/>
+      </w:rPr>
+    </w:lvl>
+    <w:lvl w:ilvl="8" w:tentative="1">
+      <w:start w:val="1"/>
+      <w:numFmt w:val="bullet"/>
+      <w:lvlText w:val=""/>
+      <w:lvlJc w:val="left"/>
+      <w:pPr>
+        <w:tabs>
+          <w:tab w:val="num" w:pos="6480"/>
+        </w:tabs>
+        <w:ind w:left="6480" w:hanging="360"/>
+      </w:pPr>
+      <w:rPr>
+        <w:rFonts w:ascii="Wingdings" w:hAnsi="Wingdings" w:hint="default"/>
+        <w:sz w:val="20"/>
+      </w:rPr>
+    </w:lvl>
+  </w:abstractNum>
+  <w:abstractNum w:abstractNumId="16" w15:restartNumberingAfterBreak="0">
+    <w:nsid w:val="568748E8"/>
+    <w:multiLevelType w:val="multilevel"/>
+    <w:tmpl w:val="74CAF48A"/>
+    <w:lvl w:ilvl="0">
+      <w:start w:val="1"/>
+      <w:numFmt w:val="bullet"/>
+      <w:lvlText w:val=""/>
+      <w:lvlJc w:val="left"/>
+      <w:pPr>
+        <w:tabs>
+          <w:tab w:val="num" w:pos="720"/>
+        </w:tabs>
+        <w:ind w:left="720" w:hanging="360"/>
+      </w:pPr>
+      <w:rPr>
+        <w:rFonts w:ascii="Symbol" w:hAnsi="Symbol" w:hint="default"/>
+        <w:sz w:val="20"/>
+      </w:rPr>
+    </w:lvl>
+    <w:lvl w:ilvl="1" w:tentative="1">
+      <w:start w:val="1"/>
+      <w:numFmt w:val="bullet"/>
+      <w:lvlText w:val="o"/>
+      <w:lvlJc w:val="left"/>
+      <w:pPr>
+        <w:tabs>
+          <w:tab w:val="num" w:pos="1440"/>
+        </w:tabs>
+        <w:ind w:left="1440" w:hanging="360"/>
+      </w:pPr>
+      <w:rPr>
+        <w:rFonts w:ascii="Courier New" w:hAnsi="Courier New" w:hint="default"/>
+        <w:sz w:val="20"/>
+      </w:rPr>
+    </w:lvl>
+    <w:lvl w:ilvl="2" w:tentative="1">
+      <w:start w:val="1"/>
+      <w:numFmt w:val="bullet"/>
+      <w:lvlText w:val=""/>
+      <w:lvlJc w:val="left"/>
+      <w:pPr>
+        <w:tabs>
+          <w:tab w:val="num" w:pos="2160"/>
+        </w:tabs>
+        <w:ind w:left="2160" w:hanging="360"/>
+      </w:pPr>
+      <w:rPr>
+        <w:rFonts w:ascii="Wingdings" w:hAnsi="Wingdings" w:hint="default"/>
+        <w:sz w:val="20"/>
+      </w:rPr>
+    </w:lvl>
+    <w:lvl w:ilvl="3" w:tentative="1">
+      <w:start w:val="1"/>
+      <w:numFmt w:val="bullet"/>
+      <w:lvlText w:val=""/>
+      <w:lvlJc w:val="left"/>
+      <w:pPr>
+        <w:tabs>
+          <w:tab w:val="num" w:pos="2880"/>
+        </w:tabs>
+        <w:ind w:left="2880" w:hanging="360"/>
+      </w:pPr>
+      <w:rPr>
+        <w:rFonts w:ascii="Wingdings" w:hAnsi="Wingdings" w:hint="default"/>
+        <w:sz w:val="20"/>
+      </w:rPr>
+    </w:lvl>
+    <w:lvl w:ilvl="4" w:tentative="1">
+      <w:start w:val="1"/>
+      <w:numFmt w:val="bullet"/>
+      <w:lvlText w:val=""/>
+      <w:lvlJc w:val="left"/>
+      <w:pPr>
+        <w:tabs>
+          <w:tab w:val="num" w:pos="3600"/>
+        </w:tabs>
+        <w:ind w:left="3600" w:hanging="360"/>
+      </w:pPr>
+      <w:rPr>
+        <w:rFonts w:ascii="Wingdings" w:hAnsi="Wingdings" w:hint="default"/>
+        <w:sz w:val="20"/>
+      </w:rPr>
+    </w:lvl>
+    <w:lvl w:ilvl="5" w:tentative="1">
+      <w:start w:val="1"/>
+      <w:numFmt w:val="bullet"/>
+      <w:lvlText w:val=""/>
+      <w:lvlJc w:val="left"/>
+      <w:pPr>
+        <w:tabs>
+          <w:tab w:val="num" w:pos="4320"/>
+        </w:tabs>
+        <w:ind w:left="4320" w:hanging="360"/>
+      </w:pPr>
+      <w:rPr>
+        <w:rFonts w:ascii="Wingdings" w:hAnsi="Wingdings" w:hint="default"/>
+        <w:sz w:val="20"/>
+      </w:rPr>
+    </w:lvl>
+    <w:lvl w:ilvl="6" w:tentative="1">
+      <w:start w:val="1"/>
+      <w:numFmt w:val="bullet"/>
+      <w:lvlText w:val=""/>
+      <w:lvlJc w:val="left"/>
+      <w:pPr>
+        <w:tabs>
+          <w:tab w:val="num" w:pos="5040"/>
+        </w:tabs>
+        <w:ind w:left="5040" w:hanging="360"/>
+      </w:pPr>
+      <w:rPr>
+        <w:rFonts w:ascii="Wingdings" w:hAnsi="Wingdings" w:hint="default"/>
+        <w:sz w:val="20"/>
+      </w:rPr>
+    </w:lvl>
+    <w:lvl w:ilvl="7" w:tentative="1">
+      <w:start w:val="1"/>
+      <w:numFmt w:val="bullet"/>
+      <w:lvlText w:val=""/>
+      <w:lvlJc w:val="left"/>
+      <w:pPr>
+        <w:tabs>
+          <w:tab w:val="num" w:pos="5760"/>
+        </w:tabs>
+        <w:ind w:left="5760" w:hanging="360"/>
+      </w:pPr>
+      <w:rPr>
+        <w:rFonts w:ascii="Wingdings" w:hAnsi="Wingdings" w:hint="default"/>
+        <w:sz w:val="20"/>
+      </w:rPr>
+    </w:lvl>
+    <w:lvl w:ilvl="8" w:tentative="1">
+      <w:start w:val="1"/>
+      <w:numFmt w:val="bullet"/>
+      <w:lvlText w:val=""/>
+      <w:lvlJc w:val="left"/>
+      <w:pPr>
+        <w:tabs>
+          <w:tab w:val="num" w:pos="6480"/>
+        </w:tabs>
+        <w:ind w:left="6480" w:hanging="360"/>
+      </w:pPr>
+      <w:rPr>
+        <w:rFonts w:ascii="Wingdings" w:hAnsi="Wingdings" w:hint="default"/>
+        <w:sz w:val="20"/>
+      </w:rPr>
+    </w:lvl>
+  </w:abstractNum>
+  <w:abstractNum w:abstractNumId="17" w15:restartNumberingAfterBreak="0">
+    <w:nsid w:val="5A9E1B85"/>
+    <w:multiLevelType w:val="multilevel"/>
+    <w:tmpl w:val="009CDCF0"/>
+    <w:lvl w:ilvl="0">
+      <w:start w:val="1"/>
+      <w:numFmt w:val="bullet"/>
+      <w:lvlText w:val=""/>
+      <w:lvlJc w:val="left"/>
+      <w:pPr>
+        <w:tabs>
+          <w:tab w:val="num" w:pos="720"/>
+        </w:tabs>
+        <w:ind w:left="720" w:hanging="360"/>
+      </w:pPr>
+      <w:rPr>
+        <w:rFonts w:ascii="Symbol" w:hAnsi="Symbol" w:hint="default"/>
+        <w:sz w:val="20"/>
+      </w:rPr>
+    </w:lvl>
+    <w:lvl w:ilvl="1" w:tentative="1">
+      <w:start w:val="1"/>
+      <w:numFmt w:val="bullet"/>
+      <w:lvlText w:val="o"/>
+      <w:lvlJc w:val="left"/>
+      <w:pPr>
+        <w:tabs>
+          <w:tab w:val="num" w:pos="1440"/>
+        </w:tabs>
+        <w:ind w:left="1440" w:hanging="360"/>
+      </w:pPr>
+      <w:rPr>
+        <w:rFonts w:ascii="Courier New" w:hAnsi="Courier New" w:hint="default"/>
+        <w:sz w:val="20"/>
+      </w:rPr>
+    </w:lvl>
+    <w:lvl w:ilvl="2" w:tentative="1">
+      <w:start w:val="1"/>
+      <w:numFmt w:val="bullet"/>
+      <w:lvlText w:val=""/>
+      <w:lvlJc w:val="left"/>
+      <w:pPr>
+        <w:tabs>
+          <w:tab w:val="num" w:pos="2160"/>
+        </w:tabs>
+        <w:ind w:left="2160" w:hanging="360"/>
+      </w:pPr>
+      <w:rPr>
+        <w:rFonts w:ascii="Wingdings" w:hAnsi="Wingdings" w:hint="default"/>
+        <w:sz w:val="20"/>
+      </w:rPr>
+    </w:lvl>
+    <w:lvl w:ilvl="3" w:tentative="1">
+      <w:start w:val="1"/>
+      <w:numFmt w:val="bullet"/>
+      <w:lvlText w:val=""/>
+      <w:lvlJc w:val="left"/>
+      <w:pPr>
+        <w:tabs>
+          <w:tab w:val="num" w:pos="2880"/>
+        </w:tabs>
+        <w:ind w:left="2880" w:hanging="360"/>
+      </w:pPr>
+      <w:rPr>
+        <w:rFonts w:ascii="Wingdings" w:hAnsi="Wingdings" w:hint="default"/>
+        <w:sz w:val="20"/>
+      </w:rPr>
+    </w:lvl>
+    <w:lvl w:ilvl="4" w:tentative="1">
+      <w:start w:val="1"/>
+      <w:numFmt w:val="bullet"/>
+      <w:lvlText w:val=""/>
+      <w:lvlJc w:val="left"/>
+      <w:pPr>
+        <w:tabs>
+          <w:tab w:val="num" w:pos="3600"/>
+        </w:tabs>
+        <w:ind w:left="3600" w:hanging="360"/>
+      </w:pPr>
+      <w:rPr>
+        <w:rFonts w:ascii="Wingdings" w:hAnsi="Wingdings" w:hint="default"/>
+        <w:sz w:val="20"/>
+      </w:rPr>
+    </w:lvl>
+    <w:lvl w:ilvl="5" w:tentative="1">
+      <w:start w:val="1"/>
+      <w:numFmt w:val="bullet"/>
+      <w:lvlText w:val=""/>
+      <w:lvlJc w:val="left"/>
+      <w:pPr>
+        <w:tabs>
+          <w:tab w:val="num" w:pos="4320"/>
+        </w:tabs>
+        <w:ind w:left="4320" w:hanging="360"/>
+      </w:pPr>
+      <w:rPr>
+        <w:rFonts w:ascii="Wingdings" w:hAnsi="Wingdings" w:hint="default"/>
+        <w:sz w:val="20"/>
+      </w:rPr>
+    </w:lvl>
+    <w:lvl w:ilvl="6" w:tentative="1">
+      <w:start w:val="1"/>
+      <w:numFmt w:val="bullet"/>
+      <w:lvlText w:val=""/>
+      <w:lvlJc w:val="left"/>
+      <w:pPr>
+        <w:tabs>
+          <w:tab w:val="num" w:pos="5040"/>
+        </w:tabs>
+        <w:ind w:left="5040" w:hanging="360"/>
+      </w:pPr>
+      <w:rPr>
+        <w:rFonts w:ascii="Wingdings" w:hAnsi="Wingdings" w:hint="default"/>
+        <w:sz w:val="20"/>
+      </w:rPr>
+    </w:lvl>
+    <w:lvl w:ilvl="7" w:tentative="1">
+      <w:start w:val="1"/>
+      <w:numFmt w:val="bullet"/>
+      <w:lvlText w:val=""/>
+      <w:lvlJc w:val="left"/>
+      <w:pPr>
+        <w:tabs>
+          <w:tab w:val="num" w:pos="5760"/>
+        </w:tabs>
+        <w:ind w:left="5760" w:hanging="360"/>
+      </w:pPr>
+      <w:rPr>
+        <w:rFonts w:ascii="Wingdings" w:hAnsi="Wingdings" w:hint="default"/>
+        <w:sz w:val="20"/>
+      </w:rPr>
+    </w:lvl>
+    <w:lvl w:ilvl="8" w:tentative="1">
+      <w:start w:val="1"/>
+      <w:numFmt w:val="bullet"/>
+      <w:lvlText w:val=""/>
+      <w:lvlJc w:val="left"/>
+      <w:pPr>
+        <w:tabs>
+          <w:tab w:val="num" w:pos="6480"/>
+        </w:tabs>
+        <w:ind w:left="6480" w:hanging="360"/>
+      </w:pPr>
+      <w:rPr>
+        <w:rFonts w:ascii="Wingdings" w:hAnsi="Wingdings" w:hint="default"/>
+        <w:sz w:val="20"/>
+      </w:rPr>
+    </w:lvl>
+  </w:abstractNum>
+  <w:abstractNum w:abstractNumId="18" w15:restartNumberingAfterBreak="0">
     <w:nsid w:val="64A60212"/>
     <w:multiLevelType w:val="hybridMultilevel"/>
     <w:tmpl w:val="387C7A0E"/>
@@ -3348,7 +5428,7 @@
       </w:rPr>
     </w:lvl>
   </w:abstractNum>
-  <w:abstractNum w:abstractNumId="5" w15:restartNumberingAfterBreak="0">
+  <w:abstractNum w:abstractNumId="19" w15:restartNumberingAfterBreak="0">
     <w:nsid w:val="68097BB4"/>
     <w:multiLevelType w:val="hybridMultilevel"/>
     <w:tmpl w:val="3F340CFE"/>
@@ -3437,7 +5517,305 @@
       </w:pPr>
     </w:lvl>
   </w:abstractNum>
-  <w:abstractNum w:abstractNumId="6" w15:restartNumberingAfterBreak="0">
+  <w:abstractNum w:abstractNumId="20" w15:restartNumberingAfterBreak="0">
+    <w:nsid w:val="75254CF2"/>
+    <w:multiLevelType w:val="multilevel"/>
+    <w:tmpl w:val="55784252"/>
+    <w:lvl w:ilvl="0">
+      <w:start w:val="1"/>
+      <w:numFmt w:val="bullet"/>
+      <w:lvlText w:val=""/>
+      <w:lvlJc w:val="left"/>
+      <w:pPr>
+        <w:tabs>
+          <w:tab w:val="num" w:pos="720"/>
+        </w:tabs>
+        <w:ind w:left="720" w:hanging="360"/>
+      </w:pPr>
+      <w:rPr>
+        <w:rFonts w:ascii="Symbol" w:hAnsi="Symbol" w:hint="default"/>
+        <w:sz w:val="20"/>
+      </w:rPr>
+    </w:lvl>
+    <w:lvl w:ilvl="1" w:tentative="1">
+      <w:start w:val="1"/>
+      <w:numFmt w:val="bullet"/>
+      <w:lvlText w:val="o"/>
+      <w:lvlJc w:val="left"/>
+      <w:pPr>
+        <w:tabs>
+          <w:tab w:val="num" w:pos="1440"/>
+        </w:tabs>
+        <w:ind w:left="1440" w:hanging="360"/>
+      </w:pPr>
+      <w:rPr>
+        <w:rFonts w:ascii="Courier New" w:hAnsi="Courier New" w:hint="default"/>
+        <w:sz w:val="20"/>
+      </w:rPr>
+    </w:lvl>
+    <w:lvl w:ilvl="2" w:tentative="1">
+      <w:start w:val="1"/>
+      <w:numFmt w:val="bullet"/>
+      <w:lvlText w:val=""/>
+      <w:lvlJc w:val="left"/>
+      <w:pPr>
+        <w:tabs>
+          <w:tab w:val="num" w:pos="2160"/>
+        </w:tabs>
+        <w:ind w:left="2160" w:hanging="360"/>
+      </w:pPr>
+      <w:rPr>
+        <w:rFonts w:ascii="Wingdings" w:hAnsi="Wingdings" w:hint="default"/>
+        <w:sz w:val="20"/>
+      </w:rPr>
+    </w:lvl>
+    <w:lvl w:ilvl="3" w:tentative="1">
+      <w:start w:val="1"/>
+      <w:numFmt w:val="bullet"/>
+      <w:lvlText w:val=""/>
+      <w:lvlJc w:val="left"/>
+      <w:pPr>
+        <w:tabs>
+          <w:tab w:val="num" w:pos="2880"/>
+        </w:tabs>
+        <w:ind w:left="2880" w:hanging="360"/>
+      </w:pPr>
+      <w:rPr>
+        <w:rFonts w:ascii="Wingdings" w:hAnsi="Wingdings" w:hint="default"/>
+        <w:sz w:val="20"/>
+      </w:rPr>
+    </w:lvl>
+    <w:lvl w:ilvl="4" w:tentative="1">
+      <w:start w:val="1"/>
+      <w:numFmt w:val="bullet"/>
+      <w:lvlText w:val=""/>
+      <w:lvlJc w:val="left"/>
+      <w:pPr>
+        <w:tabs>
+          <w:tab w:val="num" w:pos="3600"/>
+        </w:tabs>
+        <w:ind w:left="3600" w:hanging="360"/>
+      </w:pPr>
+      <w:rPr>
+        <w:rFonts w:ascii="Wingdings" w:hAnsi="Wingdings" w:hint="default"/>
+        <w:sz w:val="20"/>
+      </w:rPr>
+    </w:lvl>
+    <w:lvl w:ilvl="5" w:tentative="1">
+      <w:start w:val="1"/>
+      <w:numFmt w:val="bullet"/>
+      <w:lvlText w:val=""/>
+      <w:lvlJc w:val="left"/>
+      <w:pPr>
+        <w:tabs>
+          <w:tab w:val="num" w:pos="4320"/>
+        </w:tabs>
+        <w:ind w:left="4320" w:hanging="360"/>
+      </w:pPr>
+      <w:rPr>
+        <w:rFonts w:ascii="Wingdings" w:hAnsi="Wingdings" w:hint="default"/>
+        <w:sz w:val="20"/>
+      </w:rPr>
+    </w:lvl>
+    <w:lvl w:ilvl="6" w:tentative="1">
+      <w:start w:val="1"/>
+      <w:numFmt w:val="bullet"/>
+      <w:lvlText w:val=""/>
+      <w:lvlJc w:val="left"/>
+      <w:pPr>
+        <w:tabs>
+          <w:tab w:val="num" w:pos="5040"/>
+        </w:tabs>
+        <w:ind w:left="5040" w:hanging="360"/>
+      </w:pPr>
+      <w:rPr>
+        <w:rFonts w:ascii="Wingdings" w:hAnsi="Wingdings" w:hint="default"/>
+        <w:sz w:val="20"/>
+      </w:rPr>
+    </w:lvl>
+    <w:lvl w:ilvl="7" w:tentative="1">
+      <w:start w:val="1"/>
+      <w:numFmt w:val="bullet"/>
+      <w:lvlText w:val=""/>
+      <w:lvlJc w:val="left"/>
+      <w:pPr>
+        <w:tabs>
+          <w:tab w:val="num" w:pos="5760"/>
+        </w:tabs>
+        <w:ind w:left="5760" w:hanging="360"/>
+      </w:pPr>
+      <w:rPr>
+        <w:rFonts w:ascii="Wingdings" w:hAnsi="Wingdings" w:hint="default"/>
+        <w:sz w:val="20"/>
+      </w:rPr>
+    </w:lvl>
+    <w:lvl w:ilvl="8" w:tentative="1">
+      <w:start w:val="1"/>
+      <w:numFmt w:val="bullet"/>
+      <w:lvlText w:val=""/>
+      <w:lvlJc w:val="left"/>
+      <w:pPr>
+        <w:tabs>
+          <w:tab w:val="num" w:pos="6480"/>
+        </w:tabs>
+        <w:ind w:left="6480" w:hanging="360"/>
+      </w:pPr>
+      <w:rPr>
+        <w:rFonts w:ascii="Wingdings" w:hAnsi="Wingdings" w:hint="default"/>
+        <w:sz w:val="20"/>
+      </w:rPr>
+    </w:lvl>
+  </w:abstractNum>
+  <w:abstractNum w:abstractNumId="21" w15:restartNumberingAfterBreak="0">
+    <w:nsid w:val="775B3700"/>
+    <w:multiLevelType w:val="multilevel"/>
+    <w:tmpl w:val="4FE804AC"/>
+    <w:lvl w:ilvl="0">
+      <w:start w:val="1"/>
+      <w:numFmt w:val="bullet"/>
+      <w:lvlText w:val=""/>
+      <w:lvlJc w:val="left"/>
+      <w:pPr>
+        <w:tabs>
+          <w:tab w:val="num" w:pos="720"/>
+        </w:tabs>
+        <w:ind w:left="720" w:hanging="360"/>
+      </w:pPr>
+      <w:rPr>
+        <w:rFonts w:ascii="Symbol" w:hAnsi="Symbol" w:hint="default"/>
+        <w:sz w:val="20"/>
+      </w:rPr>
+    </w:lvl>
+    <w:lvl w:ilvl="1" w:tentative="1">
+      <w:start w:val="1"/>
+      <w:numFmt w:val="bullet"/>
+      <w:lvlText w:val="o"/>
+      <w:lvlJc w:val="left"/>
+      <w:pPr>
+        <w:tabs>
+          <w:tab w:val="num" w:pos="1440"/>
+        </w:tabs>
+        <w:ind w:left="1440" w:hanging="360"/>
+      </w:pPr>
+      <w:rPr>
+        <w:rFonts w:ascii="Courier New" w:hAnsi="Courier New" w:hint="default"/>
+        <w:sz w:val="20"/>
+      </w:rPr>
+    </w:lvl>
+    <w:lvl w:ilvl="2" w:tentative="1">
+      <w:start w:val="1"/>
+      <w:numFmt w:val="bullet"/>
+      <w:lvlText w:val=""/>
+      <w:lvlJc w:val="left"/>
+      <w:pPr>
+        <w:tabs>
+          <w:tab w:val="num" w:pos="2160"/>
+        </w:tabs>
+        <w:ind w:left="2160" w:hanging="360"/>
+      </w:pPr>
+      <w:rPr>
+        <w:rFonts w:ascii="Wingdings" w:hAnsi="Wingdings" w:hint="default"/>
+        <w:sz w:val="20"/>
+      </w:rPr>
+    </w:lvl>
+    <w:lvl w:ilvl="3" w:tentative="1">
+      <w:start w:val="1"/>
+      <w:numFmt w:val="bullet"/>
+      <w:lvlText w:val=""/>
+      <w:lvlJc w:val="left"/>
+      <w:pPr>
+        <w:tabs>
+          <w:tab w:val="num" w:pos="2880"/>
+        </w:tabs>
+        <w:ind w:left="2880" w:hanging="360"/>
+      </w:pPr>
+      <w:rPr>
+        <w:rFonts w:ascii="Wingdings" w:hAnsi="Wingdings" w:hint="default"/>
+        <w:sz w:val="20"/>
+      </w:rPr>
+    </w:lvl>
+    <w:lvl w:ilvl="4" w:tentative="1">
+      <w:start w:val="1"/>
+      <w:numFmt w:val="bullet"/>
+      <w:lvlText w:val=""/>
+      <w:lvlJc w:val="left"/>
+      <w:pPr>
+        <w:tabs>
+          <w:tab w:val="num" w:pos="3600"/>
+        </w:tabs>
+        <w:ind w:left="3600" w:hanging="360"/>
+      </w:pPr>
+      <w:rPr>
+        <w:rFonts w:ascii="Wingdings" w:hAnsi="Wingdings" w:hint="default"/>
+        <w:sz w:val="20"/>
+      </w:rPr>
+    </w:lvl>
+    <w:lvl w:ilvl="5" w:tentative="1">
+      <w:start w:val="1"/>
+      <w:numFmt w:val="bullet"/>
+      <w:lvlText w:val=""/>
+      <w:lvlJc w:val="left"/>
+      <w:pPr>
+        <w:tabs>
+          <w:tab w:val="num" w:pos="4320"/>
+        </w:tabs>
+        <w:ind w:left="4320" w:hanging="360"/>
+      </w:pPr>
+      <w:rPr>
+        <w:rFonts w:ascii="Wingdings" w:hAnsi="Wingdings" w:hint="default"/>
+        <w:sz w:val="20"/>
+      </w:rPr>
+    </w:lvl>
+    <w:lvl w:ilvl="6" w:tentative="1">
+      <w:start w:val="1"/>
+      <w:numFmt w:val="bullet"/>
+      <w:lvlText w:val=""/>
+      <w:lvlJc w:val="left"/>
+      <w:pPr>
+        <w:tabs>
+          <w:tab w:val="num" w:pos="5040"/>
+        </w:tabs>
+        <w:ind w:left="5040" w:hanging="360"/>
+      </w:pPr>
+      <w:rPr>
+        <w:rFonts w:ascii="Wingdings" w:hAnsi="Wingdings" w:hint="default"/>
+        <w:sz w:val="20"/>
+      </w:rPr>
+    </w:lvl>
+    <w:lvl w:ilvl="7" w:tentative="1">
+      <w:start w:val="1"/>
+      <w:numFmt w:val="bullet"/>
+      <w:lvlText w:val=""/>
+      <w:lvlJc w:val="left"/>
+      <w:pPr>
+        <w:tabs>
+          <w:tab w:val="num" w:pos="5760"/>
+        </w:tabs>
+        <w:ind w:left="5760" w:hanging="360"/>
+      </w:pPr>
+      <w:rPr>
+        <w:rFonts w:ascii="Wingdings" w:hAnsi="Wingdings" w:hint="default"/>
+        <w:sz w:val="20"/>
+      </w:rPr>
+    </w:lvl>
+    <w:lvl w:ilvl="8" w:tentative="1">
+      <w:start w:val="1"/>
+      <w:numFmt w:val="bullet"/>
+      <w:lvlText w:val=""/>
+      <w:lvlJc w:val="left"/>
+      <w:pPr>
+        <w:tabs>
+          <w:tab w:val="num" w:pos="6480"/>
+        </w:tabs>
+        <w:ind w:left="6480" w:hanging="360"/>
+      </w:pPr>
+      <w:rPr>
+        <w:rFonts w:ascii="Wingdings" w:hAnsi="Wingdings" w:hint="default"/>
+        <w:sz w:val="20"/>
+      </w:rPr>
+    </w:lvl>
+  </w:abstractNum>
+  <w:abstractNum w:abstractNumId="22" w15:restartNumberingAfterBreak="0">
     <w:nsid w:val="7AA729E1"/>
     <w:multiLevelType w:val="hybridMultilevel"/>
     <w:tmpl w:val="0102F6A2"/>
@@ -3524,28 +5902,228 @@
       <w:pPr>
         <w:ind w:left="6480" w:hanging="180"/>
       </w:pPr>
+    </w:lvl>
+  </w:abstractNum>
+  <w:abstractNum w:abstractNumId="23" w15:restartNumberingAfterBreak="0">
+    <w:nsid w:val="7C7858FC"/>
+    <w:multiLevelType w:val="multilevel"/>
+    <w:tmpl w:val="F1AE664C"/>
+    <w:lvl w:ilvl="0">
+      <w:start w:val="1"/>
+      <w:numFmt w:val="bullet"/>
+      <w:lvlText w:val=""/>
+      <w:lvlJc w:val="left"/>
+      <w:pPr>
+        <w:tabs>
+          <w:tab w:val="num" w:pos="720"/>
+        </w:tabs>
+        <w:ind w:left="720" w:hanging="360"/>
+      </w:pPr>
+      <w:rPr>
+        <w:rFonts w:ascii="Symbol" w:hAnsi="Symbol" w:hint="default"/>
+        <w:sz w:val="20"/>
+      </w:rPr>
+    </w:lvl>
+    <w:lvl w:ilvl="1" w:tentative="1">
+      <w:start w:val="1"/>
+      <w:numFmt w:val="bullet"/>
+      <w:lvlText w:val="o"/>
+      <w:lvlJc w:val="left"/>
+      <w:pPr>
+        <w:tabs>
+          <w:tab w:val="num" w:pos="1440"/>
+        </w:tabs>
+        <w:ind w:left="1440" w:hanging="360"/>
+      </w:pPr>
+      <w:rPr>
+        <w:rFonts w:ascii="Courier New" w:hAnsi="Courier New" w:hint="default"/>
+        <w:sz w:val="20"/>
+      </w:rPr>
+    </w:lvl>
+    <w:lvl w:ilvl="2" w:tentative="1">
+      <w:start w:val="1"/>
+      <w:numFmt w:val="bullet"/>
+      <w:lvlText w:val=""/>
+      <w:lvlJc w:val="left"/>
+      <w:pPr>
+        <w:tabs>
+          <w:tab w:val="num" w:pos="2160"/>
+        </w:tabs>
+        <w:ind w:left="2160" w:hanging="360"/>
+      </w:pPr>
+      <w:rPr>
+        <w:rFonts w:ascii="Wingdings" w:hAnsi="Wingdings" w:hint="default"/>
+        <w:sz w:val="20"/>
+      </w:rPr>
+    </w:lvl>
+    <w:lvl w:ilvl="3" w:tentative="1">
+      <w:start w:val="1"/>
+      <w:numFmt w:val="bullet"/>
+      <w:lvlText w:val=""/>
+      <w:lvlJc w:val="left"/>
+      <w:pPr>
+        <w:tabs>
+          <w:tab w:val="num" w:pos="2880"/>
+        </w:tabs>
+        <w:ind w:left="2880" w:hanging="360"/>
+      </w:pPr>
+      <w:rPr>
+        <w:rFonts w:ascii="Wingdings" w:hAnsi="Wingdings" w:hint="default"/>
+        <w:sz w:val="20"/>
+      </w:rPr>
+    </w:lvl>
+    <w:lvl w:ilvl="4" w:tentative="1">
+      <w:start w:val="1"/>
+      <w:numFmt w:val="bullet"/>
+      <w:lvlText w:val=""/>
+      <w:lvlJc w:val="left"/>
+      <w:pPr>
+        <w:tabs>
+          <w:tab w:val="num" w:pos="3600"/>
+        </w:tabs>
+        <w:ind w:left="3600" w:hanging="360"/>
+      </w:pPr>
+      <w:rPr>
+        <w:rFonts w:ascii="Wingdings" w:hAnsi="Wingdings" w:hint="default"/>
+        <w:sz w:val="20"/>
+      </w:rPr>
+    </w:lvl>
+    <w:lvl w:ilvl="5" w:tentative="1">
+      <w:start w:val="1"/>
+      <w:numFmt w:val="bullet"/>
+      <w:lvlText w:val=""/>
+      <w:lvlJc w:val="left"/>
+      <w:pPr>
+        <w:tabs>
+          <w:tab w:val="num" w:pos="4320"/>
+        </w:tabs>
+        <w:ind w:left="4320" w:hanging="360"/>
+      </w:pPr>
+      <w:rPr>
+        <w:rFonts w:ascii="Wingdings" w:hAnsi="Wingdings" w:hint="default"/>
+        <w:sz w:val="20"/>
+      </w:rPr>
+    </w:lvl>
+    <w:lvl w:ilvl="6" w:tentative="1">
+      <w:start w:val="1"/>
+      <w:numFmt w:val="bullet"/>
+      <w:lvlText w:val=""/>
+      <w:lvlJc w:val="left"/>
+      <w:pPr>
+        <w:tabs>
+          <w:tab w:val="num" w:pos="5040"/>
+        </w:tabs>
+        <w:ind w:left="5040" w:hanging="360"/>
+      </w:pPr>
+      <w:rPr>
+        <w:rFonts w:ascii="Wingdings" w:hAnsi="Wingdings" w:hint="default"/>
+        <w:sz w:val="20"/>
+      </w:rPr>
+    </w:lvl>
+    <w:lvl w:ilvl="7" w:tentative="1">
+      <w:start w:val="1"/>
+      <w:numFmt w:val="bullet"/>
+      <w:lvlText w:val=""/>
+      <w:lvlJc w:val="left"/>
+      <w:pPr>
+        <w:tabs>
+          <w:tab w:val="num" w:pos="5760"/>
+        </w:tabs>
+        <w:ind w:left="5760" w:hanging="360"/>
+      </w:pPr>
+      <w:rPr>
+        <w:rFonts w:ascii="Wingdings" w:hAnsi="Wingdings" w:hint="default"/>
+        <w:sz w:val="20"/>
+      </w:rPr>
+    </w:lvl>
+    <w:lvl w:ilvl="8" w:tentative="1">
+      <w:start w:val="1"/>
+      <w:numFmt w:val="bullet"/>
+      <w:lvlText w:val=""/>
+      <w:lvlJc w:val="left"/>
+      <w:pPr>
+        <w:tabs>
+          <w:tab w:val="num" w:pos="6480"/>
+        </w:tabs>
+        <w:ind w:left="6480" w:hanging="360"/>
+      </w:pPr>
+      <w:rPr>
+        <w:rFonts w:ascii="Wingdings" w:hAnsi="Wingdings" w:hint="default"/>
+        <w:sz w:val="20"/>
+      </w:rPr>
     </w:lvl>
   </w:abstractNum>
   <w:num w:numId="1" w16cid:durableId="79060960">
     <w:abstractNumId w:val="0"/>
   </w:num>
   <w:num w:numId="2" w16cid:durableId="177161130">
+    <w:abstractNumId w:val="12"/>
+  </w:num>
+  <w:num w:numId="3" w16cid:durableId="1151098499">
+    <w:abstractNumId w:val="22"/>
+  </w:num>
+  <w:num w:numId="4" w16cid:durableId="1321084714">
+    <w:abstractNumId w:val="14"/>
+  </w:num>
+  <w:num w:numId="5" w16cid:durableId="558054461">
+    <w:abstractNumId w:val="19"/>
+  </w:num>
+  <w:num w:numId="6" w16cid:durableId="1128627636">
+    <w:abstractNumId w:val="6"/>
+  </w:num>
+  <w:num w:numId="7" w16cid:durableId="237129251">
+    <w:abstractNumId w:val="18"/>
+  </w:num>
+  <w:num w:numId="8" w16cid:durableId="1800755186">
+    <w:abstractNumId w:val="10"/>
+  </w:num>
+  <w:num w:numId="9" w16cid:durableId="828865218">
+    <w:abstractNumId w:val="17"/>
+  </w:num>
+  <w:num w:numId="10" w16cid:durableId="43844054">
+    <w:abstractNumId w:val="15"/>
+  </w:num>
+  <w:num w:numId="11" w16cid:durableId="1183402166">
+    <w:abstractNumId w:val="3"/>
+  </w:num>
+  <w:num w:numId="12" w16cid:durableId="2020349443">
+    <w:abstractNumId w:val="16"/>
+  </w:num>
+  <w:num w:numId="13" w16cid:durableId="95255435">
+    <w:abstractNumId w:val="23"/>
+  </w:num>
+  <w:num w:numId="14" w16cid:durableId="1464813709">
+    <w:abstractNumId w:val="13"/>
+  </w:num>
+  <w:num w:numId="15" w16cid:durableId="340475840">
+    <w:abstractNumId w:val="4"/>
+  </w:num>
+  <w:num w:numId="16" w16cid:durableId="1566069217">
+    <w:abstractNumId w:val="20"/>
+  </w:num>
+  <w:num w:numId="17" w16cid:durableId="2098280208">
+    <w:abstractNumId w:val="5"/>
+  </w:num>
+  <w:num w:numId="18" w16cid:durableId="517741210">
     <w:abstractNumId w:val="2"/>
   </w:num>
-  <w:num w:numId="3" w16cid:durableId="1151098499">
-    <w:abstractNumId w:val="6"/>
-  </w:num>
-  <w:num w:numId="4" w16cid:durableId="1321084714">
-    <w:abstractNumId w:val="3"/>
-  </w:num>
-  <w:num w:numId="5" w16cid:durableId="558054461">
-    <w:abstractNumId w:val="5"/>
-  </w:num>
-  <w:num w:numId="6" w16cid:durableId="1128627636">
+  <w:num w:numId="19" w16cid:durableId="1576428832">
     <w:abstractNumId w:val="1"/>
   </w:num>
-  <w:num w:numId="7" w16cid:durableId="237129251">
-    <w:abstractNumId w:val="4"/>
+  <w:num w:numId="20" w16cid:durableId="24213863">
+    <w:abstractNumId w:val="9"/>
+  </w:num>
+  <w:num w:numId="21" w16cid:durableId="330569089">
+    <w:abstractNumId w:val="11"/>
+  </w:num>
+  <w:num w:numId="22" w16cid:durableId="845902381">
+    <w:abstractNumId w:val="8"/>
+  </w:num>
+  <w:num w:numId="23" w16cid:durableId="1531726769">
+    <w:abstractNumId w:val="21"/>
+  </w:num>
+  <w:num w:numId="24" w16cid:durableId="1321497169">
+    <w:abstractNumId w:val="7"/>
   </w:num>
 </w:numbering>
 </file>
@@ -4530,6 +7108,120 @@
       <w:shd w:val="clear" w:color="auto" w:fill="E1DFDD"/>
     </w:rPr>
   </w:style>
+  <w:style w:type="table" w:styleId="Grigliatabella">
+    <w:name w:val="Table Grid"/>
+    <w:basedOn w:val="Tabellanormale"/>
+    <w:uiPriority w:val="39"/>
+    <w:rsid w:val="00050D5B"/>
+    <w:pPr>
+      <w:spacing w:after="0" w:line="240" w:lineRule="auto"/>
+    </w:pPr>
+    <w:tblPr>
+      <w:tblBorders>
+        <w:top w:val="single" w:sz="4" w:space="0" w:color="auto"/>
+        <w:left w:val="single" w:sz="4" w:space="0" w:color="auto"/>
+        <w:bottom w:val="single" w:sz="4" w:space="0" w:color="auto"/>
+        <w:right w:val="single" w:sz="4" w:space="0" w:color="auto"/>
+        <w:insideH w:val="single" w:sz="4" w:space="0" w:color="auto"/>
+        <w:insideV w:val="single" w:sz="4" w:space="0" w:color="auto"/>
+      </w:tblBorders>
+    </w:tblPr>
+  </w:style>
+  <w:style w:type="paragraph" w:styleId="Titolosommario">
+    <w:name w:val="TOC Heading"/>
+    <w:basedOn w:val="Titolo1"/>
+    <w:next w:val="Normale"/>
+    <w:uiPriority w:val="39"/>
+    <w:unhideWhenUsed/>
+    <w:qFormat/>
+    <w:rsid w:val="002A7DF8"/>
+    <w:pPr>
+      <w:spacing w:before="240" w:after="0"/>
+      <w:outlineLvl w:val="9"/>
+    </w:pPr>
+    <w:rPr>
+      <w:kern w:val="0"/>
+      <w:sz w:val="32"/>
+      <w:szCs w:val="32"/>
+      <w:lang w:eastAsia="it-IT"/>
+      <w14:ligatures w14:val="none"/>
+    </w:rPr>
+  </w:style>
+  <w:style w:type="paragraph" w:styleId="Sommario2">
+    <w:name w:val="toc 2"/>
+    <w:basedOn w:val="Normale"/>
+    <w:next w:val="Normale"/>
+    <w:autoRedefine/>
+    <w:uiPriority w:val="39"/>
+    <w:unhideWhenUsed/>
+    <w:rsid w:val="002A7DF8"/>
+    <w:pPr>
+      <w:spacing w:after="100"/>
+      <w:ind w:left="220"/>
+    </w:pPr>
+    <w:rPr>
+      <w:rFonts w:eastAsiaTheme="minorEastAsia" w:cs="Times New Roman"/>
+      <w:kern w:val="0"/>
+      <w:lang w:eastAsia="it-IT"/>
+      <w14:ligatures w14:val="none"/>
+    </w:rPr>
+  </w:style>
+  <w:style w:type="paragraph" w:styleId="Sommario1">
+    <w:name w:val="toc 1"/>
+    <w:basedOn w:val="Normale"/>
+    <w:next w:val="Normale"/>
+    <w:autoRedefine/>
+    <w:uiPriority w:val="39"/>
+    <w:unhideWhenUsed/>
+    <w:rsid w:val="002A7DF8"/>
+    <w:pPr>
+      <w:spacing w:after="100"/>
+    </w:pPr>
+    <w:rPr>
+      <w:rFonts w:eastAsiaTheme="minorEastAsia" w:cs="Times New Roman"/>
+      <w:kern w:val="0"/>
+      <w:lang w:eastAsia="it-IT"/>
+      <w14:ligatures w14:val="none"/>
+    </w:rPr>
+  </w:style>
+  <w:style w:type="paragraph" w:styleId="Sommario3">
+    <w:name w:val="toc 3"/>
+    <w:basedOn w:val="Normale"/>
+    <w:next w:val="Normale"/>
+    <w:autoRedefine/>
+    <w:uiPriority w:val="39"/>
+    <w:unhideWhenUsed/>
+    <w:rsid w:val="002A7DF8"/>
+    <w:pPr>
+      <w:spacing w:after="100"/>
+      <w:ind w:left="440"/>
+    </w:pPr>
+    <w:rPr>
+      <w:rFonts w:eastAsiaTheme="minorEastAsia" w:cs="Times New Roman"/>
+      <w:kern w:val="0"/>
+      <w:lang w:eastAsia="it-IT"/>
+      <w14:ligatures w14:val="none"/>
+    </w:rPr>
+  </w:style>
+  <w:style w:type="paragraph" w:styleId="Didascalia">
+    <w:name w:val="caption"/>
+    <w:basedOn w:val="Normale"/>
+    <w:next w:val="Normale"/>
+    <w:uiPriority w:val="35"/>
+    <w:unhideWhenUsed/>
+    <w:qFormat/>
+    <w:rsid w:val="00FE7E63"/>
+    <w:pPr>
+      <w:spacing w:after="200" w:line="240" w:lineRule="auto"/>
+    </w:pPr>
+    <w:rPr>
+      <w:i/>
+      <w:iCs/>
+      <w:color w:val="44546A" w:themeColor="text2"/>
+      <w:sz w:val="18"/>
+      <w:szCs w:val="18"/>
+    </w:rPr>
+  </w:style>
 </w:styles>
 </file>
 
@@ -4839,10 +7531,22 @@
 </CoverPageProperties>
 </file>
 
+<file path=customXml/item2.xml><?xml version="1.0" encoding="utf-8"?>
+<b:Sources xmlns:b="http://schemas.openxmlformats.org/officeDocument/2006/bibliography" xmlns="http://schemas.openxmlformats.org/officeDocument/2006/bibliography" SelectedStyle="\APASixthEditionOfficeOnline.xsl" StyleName="APA" Version="6"/>
+</file>
+
 <file path=customXml/itemProps1.xml><?xml version="1.0" encoding="utf-8"?>
 <ds:datastoreItem xmlns:ds="http://schemas.openxmlformats.org/officeDocument/2006/customXml" ds:itemID="{55AF091B-3C7A-41E3-B477-F2FDAA23CFDA}">
   <ds:schemaRefs>
     <ds:schemaRef ds:uri="http://schemas.microsoft.com/office/2006/coverPageProps"/>
   </ds:schemaRefs>
 </ds:datastoreItem>
+</file>
+
+<file path=customXml/itemProps2.xml><?xml version="1.0" encoding="utf-8"?>
+<ds:datastoreItem xmlns:ds="http://schemas.openxmlformats.org/officeDocument/2006/customXml" ds:itemID="{2A140AF1-AAAB-40A1-AA46-5DB9173940E1}">
+  <ds:schemaRefs>
+    <ds:schemaRef ds:uri="http://schemas.openxmlformats.org/officeDocument/2006/bibliography"/>
+  </ds:schemaRefs>
+</ds:datastoreItem>
 </file>
</xml_diff>

<commit_message>
package-info e manuale utente
aggiunta del package-info per theknife.common.util e modifica manuale utente
</commit_message>
<xml_diff>
--- a/Progettazione/Manuale utente.docx
+++ b/Progettazione/Manuale utente.docx
@@ -536,7 +536,11 @@
               </mc:Choice>
               <mc:Fallback>
                 <w:pict>
-                  <v:shape w14:anchorId="52064168" id="Casella di testo 129" o:spid="_x0000_s1028" type="#_x0000_t202" style="position:absolute;left:0;text-align:left;margin-left:19.8pt;margin-top:613.2pt;width:453pt;height:141.6pt;z-index:251661312;visibility:visible;mso-wrap-style:square;mso-width-percent:1154;mso-height-percent:0;mso-wrap-distance-left:9pt;mso-wrap-distance-top:0;mso-wrap-distance-right:9pt;mso-wrap-distance-bottom:0;mso-position-horizontal:absolute;mso-position-horizontal-relative:page;mso-position-vertical:absolute;mso-position-vertical-relative:page;mso-width-percent:1154;mso-height-percent:0;mso-width-relative:margin;mso-height-relative:margin;v-text-anchor:top" o:gfxdata="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" filled="f" strokecolor="#ffc000 [3207]" strokeweight=".5pt">
+                  <v:shapetype w14:anchorId="52064168" id="_x0000_t202" coordsize="21600,21600" o:spt="202" path="m,l,21600r21600,l21600,xe">
+                    <v:stroke joinstyle="miter"/>
+                    <v:path gradientshapeok="t" o:connecttype="rect"/>
+                  </v:shapetype>
+                  <v:shape id="Casella di testo 129" o:spid="_x0000_s1028" type="#_x0000_t202" style="position:absolute;left:0;text-align:left;margin-left:19.8pt;margin-top:613.2pt;width:453pt;height:141.6pt;z-index:251661312;visibility:visible;mso-wrap-style:square;mso-width-percent:1154;mso-height-percent:0;mso-wrap-distance-left:9pt;mso-wrap-distance-top:0;mso-wrap-distance-right:9pt;mso-wrap-distance-bottom:0;mso-position-horizontal:absolute;mso-position-horizontal-relative:page;mso-position-vertical:absolute;mso-position-vertical-relative:page;mso-width-percent:1154;mso-height-percent:0;mso-width-relative:margin;mso-height-relative:margin;v-text-anchor:top" o:gfxdata="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" filled="f" strokecolor="#ffc000 [3207]" strokeweight=".5pt">
                     <v:textbox inset="1in,0,86.4pt,0">
                       <w:txbxContent>
                         <w:sdt>
@@ -1206,7 +1210,8 @@
           <w:sz w:val="52"/>
           <w:szCs w:val="52"/>
         </w:rPr>
-        <w:t xml:space="preserve">Indice</w:t>
+        <w:lastRenderedPageBreak/>
+        <w:t>Indice</w:t>
       </w:r>
     </w:p>
     <w:p>
@@ -1227,7 +1232,7 @@
           <w:sz w:val="28"/>
           <w:szCs w:val="28"/>
         </w:rPr>
-        <w:t xml:space="preserve">1. Introduzione</w:t>
+        <w:t>1. Introduzione</w:t>
       </w:r>
     </w:p>
     <w:p>
@@ -1248,7 +1253,7 @@
           <w:sz w:val="28"/>
           <w:szCs w:val="28"/>
         </w:rPr>
-        <w:t xml:space="preserve">2. Installazione</w:t>
+        <w:t>2. Installazione</w:t>
       </w:r>
     </w:p>
     <w:p>
@@ -1269,7 +1274,7 @@
           <w:sz w:val="28"/>
           <w:szCs w:val="28"/>
         </w:rPr>
-        <w:t xml:space="preserve">2.1 Requisiti di sistema</w:t>
+        <w:t>2.1 Requisiti di sistema</w:t>
       </w:r>
     </w:p>
     <w:p>
@@ -1290,7 +1295,7 @@
           <w:sz w:val="28"/>
           <w:szCs w:val="28"/>
         </w:rPr>
-        <w:t xml:space="preserve">2.2 Setup dell'ambiente</w:t>
+        <w:t>2.2 Setup dell'ambiente</w:t>
       </w:r>
     </w:p>
     <w:p>
@@ -1311,7 +1316,7 @@
           <w:sz w:val="28"/>
           <w:szCs w:val="28"/>
         </w:rPr>
-        <w:t xml:space="preserve">2.3 Installazione del programma</w:t>
+        <w:t>2.3 Installazione del programma</w:t>
       </w:r>
     </w:p>
     <w:p>
@@ -1332,7 +1337,7 @@
           <w:sz w:val="28"/>
           <w:szCs w:val="28"/>
         </w:rPr>
-        <w:t xml:space="preserve">3. Esecuzione e uso</w:t>
+        <w:t>3. Esecuzione e uso</w:t>
       </w:r>
     </w:p>
     <w:p>
@@ -1353,7 +1358,7 @@
           <w:sz w:val="28"/>
           <w:szCs w:val="28"/>
         </w:rPr>
-        <w:t xml:space="preserve">3.1 Setup e lancio del programma</w:t>
+        <w:t>3.1 Setup e lancio del programma</w:t>
       </w:r>
     </w:p>
     <w:p>
@@ -1374,7 +1379,7 @@
           <w:sz w:val="28"/>
           <w:szCs w:val="28"/>
         </w:rPr>
-        <w:t xml:space="preserve">3.2 Uso delle funzionalità</w:t>
+        <w:t>3.2 Uso delle funzionalità</w:t>
       </w:r>
     </w:p>
     <w:p>
@@ -1395,7 +1400,7 @@
           <w:sz w:val="28"/>
           <w:szCs w:val="28"/>
         </w:rPr>
-        <w:t xml:space="preserve">3.2.1 Ospite (senza registrazione)</w:t>
+        <w:t>3.2.1 Ospite (senza registrazione)</w:t>
       </w:r>
     </w:p>
     <w:p>
@@ -1416,7 +1421,7 @@
           <w:sz w:val="28"/>
           <w:szCs w:val="28"/>
         </w:rPr>
-        <w:t xml:space="preserve">3.2.2 Cliente registrato</w:t>
+        <w:t>3.2.2 Cliente registrato</w:t>
       </w:r>
     </w:p>
     <w:p>
@@ -1437,7 +1442,7 @@
           <w:sz w:val="28"/>
           <w:szCs w:val="28"/>
         </w:rPr>
-        <w:t xml:space="preserve">3.2.3 Ristoratore registrato</w:t>
+        <w:t>3.2.3 Ristoratore registrato</w:t>
       </w:r>
     </w:p>
     <w:p>
@@ -1458,7 +1463,7 @@
           <w:sz w:val="28"/>
           <w:szCs w:val="28"/>
         </w:rPr>
-        <w:t xml:space="preserve">4. Data set di test</w:t>
+        <w:t>4. Data set di test</w:t>
       </w:r>
     </w:p>
     <w:p>
@@ -1479,7 +1484,7 @@
           <w:sz w:val="28"/>
           <w:szCs w:val="28"/>
         </w:rPr>
-        <w:t xml:space="preserve">4.1 Utenti di prova per l'accesso</w:t>
+        <w:t>4.1 Utenti di prova per l'accesso</w:t>
       </w:r>
     </w:p>
     <w:p>
@@ -1500,7 +1505,7 @@
           <w:sz w:val="28"/>
           <w:szCs w:val="28"/>
         </w:rPr>
-        <w:t xml:space="preserve">5. Limiti della soluzione sviluppata</w:t>
+        <w:t>5. Limiti della soluzione sviluppata</w:t>
       </w:r>
     </w:p>
     <w:p>
@@ -1521,7 +1526,7 @@
           <w:sz w:val="28"/>
           <w:szCs w:val="28"/>
         </w:rPr>
-        <w:t xml:space="preserve">6. Sitografia / Bibliografia</w:t>
+        <w:t>6. Sitografia / Bibliografia</w:t>
       </w:r>
     </w:p>
     <w:p>
@@ -1540,7 +1545,7 @@
           <w:sz w:val="52"/>
           <w:szCs w:val="52"/>
         </w:rPr>
-        <w:t xml:space="preserve">1. Introduzione</w:t>
+        <w:t>1. Introduzione</w:t>
       </w:r>
     </w:p>
     <w:p>
@@ -1556,7 +1561,7 @@
           <w:sz w:val="28"/>
           <w:szCs w:val="28"/>
         </w:rPr>
-        <w:t xml:space="preserve">The Knife è un'applicazione che permette di trovare e scoprire ristoranti in tutto il mondo, consultarne le recensioni e gestire ristoranti propri, in modo simile alla nota piattaforma TheFork. Il programma è stato sviluppato nell'ambito del Laboratorio Interdisciplinare B del corso di laurea in Informatica dell'Università degli Studi dell'Insubria ed è disponibile per i sistemi operativi Windows 10/11 e macOS.</w:t>
+        <w:t>The Knife è un'applicazione che permette di trovare e scoprire ristoranti in tutto il mondo, consultarne le recensioni e gestire ristoranti propri, in modo simile alla nota piattaforma TheFork. Il programma è stato sviluppato nell'ambito del Laboratorio Interdisciplinare B del corso di laurea in Informatica dell'Università degli Studi dell'Insubria ed è disponibile per i sistemi operativi Windows 10/11 e macOS.</w:t>
       </w:r>
     </w:p>
     <w:p>
@@ -1572,7 +1577,7 @@
           <w:sz w:val="28"/>
           <w:szCs w:val="28"/>
         </w:rPr>
-        <w:t xml:space="preserve">L'applicazione è organizzata come un sistema client-server: un server gestisce i dati e le richieste, mentre uno o più client con interfaccia grafica permettono agli utenti di interagire con la piattaforma. Il presente manuale spiega, in modo semplice e senza termini tecnici, come installare, avviare e utilizzare The Knife. Ogni funzionalità è descritta passo per passo e illustrata con screenshot.</w:t>
+        <w:t>L'applicazione è organizzata come un sistema client-server: un server gestisce i dati e le richieste, mentre uno o più client con interfaccia grafica permettono agli utenti di interagire con la piattaforma. Il presente manuale spiega, in modo semplice e senza termini tecnici, come installare, avviare e utilizzare The Knife. Ogni funzionalità è descritta passo per passo e illustrata con screenshot.</w:t>
       </w:r>
     </w:p>
     <w:p>
@@ -1591,7 +1596,7 @@
           <w:sz w:val="52"/>
           <w:szCs w:val="52"/>
         </w:rPr>
-        <w:t xml:space="preserve">2. Installazione</w:t>
+        <w:t>2. Installazione</w:t>
       </w:r>
     </w:p>
     <w:p>
@@ -1610,7 +1615,7 @@
           <w:sz w:val="40"/>
           <w:szCs w:val="40"/>
         </w:rPr>
-        <w:t xml:space="preserve">2.1 Requisiti di sistema</w:t>
+        <w:t>2.1 Requisiti di sistema</w:t>
       </w:r>
     </w:p>
     <w:p>
@@ -1626,7 +1631,7 @@
           <w:sz w:val="28"/>
           <w:szCs w:val="28"/>
         </w:rPr>
-        <w:t xml:space="preserve">Per installare ed eseguire The Knife sono necessari:</w:t>
+        <w:t>Per installare ed eseguire The Knife sono necessari:</w:t>
       </w:r>
     </w:p>
     <w:p>
@@ -1647,7 +1652,7 @@
           <w:sz w:val="28"/>
           <w:szCs w:val="28"/>
         </w:rPr>
-        <w:t xml:space="preserve">un computer con sistema operativo Windows 10/11 oppure macOS;</w:t>
+        <w:t>un computer con sistema operativo Windows 10/11 oppure macOS;</w:t>
       </w:r>
     </w:p>
     <w:p>
@@ -1668,7 +1673,7 @@
           <w:sz w:val="28"/>
           <w:szCs w:val="28"/>
         </w:rPr>
-        <w:t xml:space="preserve">il Java Development Kit (JDK) versione 21 (es. Temurin);</w:t>
+        <w:t>il Java Development Kit (JDK) versione 21 (es. Temurin);</w:t>
       </w:r>
     </w:p>
     <w:p>
@@ -1689,7 +1694,8 @@
           <w:sz w:val="28"/>
           <w:szCs w:val="28"/>
         </w:rPr>
-        <w:t xml:space="preserve">Apache Maven, lo strumento che compila il programma (richiede anche JavaFX per l'interfaccia);</w:t>
+        <w:lastRenderedPageBreak/>
+        <w:t>Apache Maven, lo strumento che compila il programma (richiede anche JavaFX per l'interfaccia);</w:t>
       </w:r>
     </w:p>
     <w:p>
@@ -1710,7 +1716,7 @@
           <w:sz w:val="28"/>
           <w:szCs w:val="28"/>
         </w:rPr>
-        <w:t xml:space="preserve">PostgreSQL, il database in cui vengono conservati i dati, in esecuzione sulla macchina del server.</w:t>
+        <w:t>PostgreSQL, il database in cui vengono conservati i dati, in esecuzione sulla macchina del server.</w:t>
       </w:r>
     </w:p>
     <w:p>
@@ -1729,7 +1735,7 @@
           <w:sz w:val="40"/>
           <w:szCs w:val="40"/>
         </w:rPr>
-        <w:t xml:space="preserve">2.2 Setup dell'ambiente</w:t>
+        <w:t>2.2 Setup dell'ambiente</w:t>
       </w:r>
     </w:p>
     <w:p>
@@ -1745,7 +1751,7 @@
           <w:sz w:val="28"/>
           <w:szCs w:val="28"/>
         </w:rPr>
-        <w:t xml:space="preserve">Innanzitutto, installare sul computer un JDK 21 e Apache Maven. Scaricare poi il codice sorgente del progetto dal repository GitHub del team e aprire la cartella del progetto.</w:t>
+        <w:t>Innanzitutto, installare sul computer un JDK 21 e Apache Maven. Scaricare poi il codice sorgente del progetto dal repository GitHub del team e aprire la cartella del progetto.</w:t>
       </w:r>
     </w:p>
     <w:p>
@@ -1761,7 +1767,7 @@
           <w:sz w:val="28"/>
           <w:szCs w:val="28"/>
         </w:rPr>
-        <w:t xml:space="preserve">Il programma conserva i dati in una base di dati PostgreSQL chiamata dbTK. Il database va creato eseguendo, nell'ordine, cinque script SQL che si trovano nella cartella Progettazione/1_Doc. Conclusi/Database/:</w:t>
+        <w:t>Il programma conserva i dati in una base di dati PostgreSQL chiamata dbTK. Il database va creato eseguendo, nell'ordine, cinque script SQL che si trovano nella cartella Progettazione/1_Doc. Conclusi/Database/:</w:t>
       </w:r>
     </w:p>
     <w:p>
@@ -1782,7 +1788,7 @@
           <w:sz w:val="28"/>
           <w:szCs w:val="28"/>
         </w:rPr>
-        <w:t xml:space="preserve">Role.sql — crea il database e l'utente applicativo;</w:t>
+        <w:t>Role.sql — crea il database e l'utente applicativo;</w:t>
       </w:r>
     </w:p>
     <w:p>
@@ -1803,7 +1809,7 @@
           <w:sz w:val="28"/>
           <w:szCs w:val="28"/>
         </w:rPr>
-        <w:t xml:space="preserve">Schema.sql — crea le tabelle (ristoranti, utenti, recensioni, preferiti, servizi);</w:t>
+        <w:t>Schema.sql — crea le tabelle (ristoranti, utenti, recensioni, preferiti, servizi);</w:t>
       </w:r>
     </w:p>
     <w:p>
@@ -1824,7 +1830,7 @@
           <w:sz w:val="28"/>
           <w:szCs w:val="28"/>
         </w:rPr>
-        <w:t xml:space="preserve">Data.sql — carica i ristoranti del data set di prova;</w:t>
+        <w:t>Data.sql — carica i ristoranti del data set di prova;</w:t>
       </w:r>
     </w:p>
     <w:p>
@@ -1845,7 +1851,7 @@
           <w:sz w:val="28"/>
           <w:szCs w:val="28"/>
         </w:rPr>
-        <w:t xml:space="preserve">AbilitaServiziTest.sql — abilita i servizi di prenotazione online e consegna a domicilio per i ristoranti di prova;</w:t>
+        <w:t>AbilitaServiziTest.sql — abilita i servizi di prenotazione online e consegna a domicilio per i ristoranti di prova;</w:t>
       </w:r>
     </w:p>
     <w:p>
@@ -1866,7 +1872,7 @@
           <w:sz w:val="28"/>
           <w:szCs w:val="28"/>
         </w:rPr>
-        <w:t xml:space="preserve">PopolaRecensioniTest.sql — inserisce recensioni fittizie per popolare il data set di test.</w:t>
+        <w:t>PopolaRecensioniTest.sql — inserisce recensioni fittizie per popolare il data set di test.</w:t>
       </w:r>
     </w:p>
     <w:p>
@@ -1885,7 +1891,7 @@
           <w:sz w:val="40"/>
           <w:szCs w:val="40"/>
         </w:rPr>
-        <w:t xml:space="preserve">2.3 Installazione del programma</w:t>
+        <w:t>2.3 Installazione del programma</w:t>
       </w:r>
     </w:p>
     <w:p>
@@ -1901,7 +1907,7 @@
           <w:sz w:val="28"/>
           <w:szCs w:val="28"/>
         </w:rPr>
-        <w:t xml:space="preserve">Dalla cartella del progetto, compilare l'applicazione con il comando:</w:t>
+        <w:t>Dalla cartella del progetto, compilare l'applicazione con il comando:</w:t>
       </w:r>
     </w:p>
     <w:p>
@@ -1921,7 +1927,7 @@
           <w:sz w:val="28"/>
           <w:szCs w:val="28"/>
         </w:rPr>
-        <w:t xml:space="preserve">mvn clean package</w:t>
+        <w:t>mvn clean package</w:t>
       </w:r>
     </w:p>
     <w:p>
@@ -1937,7 +1943,7 @@
           <w:sz w:val="28"/>
           <w:szCs w:val="28"/>
         </w:rPr>
-        <w:t xml:space="preserve">Il comando produce due programmi eseguibili pronti all'uso: il server (theknife-server/target/serverTK.jar) e il client con interfaccia grafica (theknife-client/target/clientTK.jar).</w:t>
+        <w:t>Il comando produce due programmi eseguibili pronti all'uso: il server (theknife-server/target/serverTK.jar) e il client con interfaccia grafica (theknife-client/target/clientTK.jar).</w:t>
       </w:r>
     </w:p>
     <w:p>
@@ -1956,7 +1962,7 @@
           <w:sz w:val="52"/>
           <w:szCs w:val="52"/>
         </w:rPr>
-        <w:t xml:space="preserve">3. Esecuzione e uso</w:t>
+        <w:t>3. Esecuzione e uso</w:t>
       </w:r>
     </w:p>
     <w:p>
@@ -1975,7 +1981,7 @@
           <w:sz w:val="40"/>
           <w:szCs w:val="40"/>
         </w:rPr>
-        <w:t xml:space="preserve">3.1 Setup e lancio del programma</w:t>
+        <w:t>3.1 Setup e lancio del programma</w:t>
       </w:r>
     </w:p>
     <w:p>
@@ -1991,7 +1997,7 @@
           <w:sz w:val="28"/>
           <w:szCs w:val="28"/>
         </w:rPr>
-        <w:t xml:space="preserve">1) Avviare il server. Aprire un terminale nella cartella del progetto ed eseguire:</w:t>
+        <w:t>1) Avviare il server. Aprire un terminale nella cartella del progetto ed eseguire:</w:t>
       </w:r>
     </w:p>
     <w:p>
@@ -2011,7 +2017,7 @@
           <w:sz w:val="28"/>
           <w:szCs w:val="28"/>
         </w:rPr>
-        <w:t xml:space="preserve">java -jar theknife-server/target/serverTK.jar</w:t>
+        <w:t>java -jar theknife-server/target/serverTK.jar</w:t>
       </w:r>
     </w:p>
     <w:p>
@@ -2027,7 +2033,7 @@
           <w:sz w:val="28"/>
           <w:szCs w:val="28"/>
         </w:rPr>
-        <w:t xml:space="preserve">Il server chiede all'avvio host, utente e password del database: inserire quelli usati in fase di creazione del database. La porta di ascolto predefinita è 9999 e può essere cambiata passando un argomento (es. java -jar serverTK.jar 9000).</w:t>
+        <w:t>Il server chiede all'avvio host, utente e password del database: inserire quelli usati in fase di creazione del database. La porta di ascolto predefinita è 9999 e può essere cambiata passando un argomento (es. java -jar serverTK.jar 9000).</w:t>
       </w:r>
     </w:p>
     <w:p>
@@ -2043,7 +2049,8 @@
           <w:sz w:val="28"/>
           <w:szCs w:val="28"/>
         </w:rPr>
-        <w:t xml:space="preserve">2) Avviare uno o più client, anche da macchine diverse sulla stessa rete:</w:t>
+        <w:lastRenderedPageBreak/>
+        <w:t>2) Avviare uno o più client, anche da macchine diverse sulla stessa rete:</w:t>
       </w:r>
     </w:p>
     <w:p>
@@ -2063,7 +2070,7 @@
           <w:sz w:val="28"/>
           <w:szCs w:val="28"/>
         </w:rPr>
-        <w:t xml:space="preserve">java -jar theknife-client/target/clientTK.jar</w:t>
+        <w:t>java -jar theknife-client/target/clientTK.jar</w:t>
       </w:r>
     </w:p>
     <w:p>
@@ -2079,7 +2086,7 @@
           <w:sz w:val="28"/>
           <w:szCs w:val="28"/>
         </w:rPr>
-        <w:t xml:space="preserve">Se il server è su un'altra macchina, indicarne host e porta: java -jar clientTK.jar indirizzo-del-server porta. Senza argomenti il client prova a collegarsi a localhost:9999.</w:t>
+        <w:t>Se il server è su un'altra macchina, indicarne host e porta: java -jar clientTK.jar indirizzo-del-server porta. Senza argomenti il client prova a collegarsi a localhost:9999.</w:t>
       </w:r>
     </w:p>
     <w:p>
@@ -2095,7 +2102,7 @@
           <w:sz w:val="28"/>
           <w:szCs w:val="28"/>
         </w:rPr>
-        <w:t xml:space="preserve">All'avvio compare la schermata iniziale del programma (Splash).</w:t>
+        <w:t>All'avvio compare la schermata iniziale del programma (Splash).</w:t>
       </w:r>
     </w:p>
     <w:p>
@@ -2111,7 +2118,7 @@
           <w:sz w:val="28"/>
           <w:szCs w:val="28"/>
         </w:rPr>
-        <w:t xml:space="preserve">[Screenshot: schermata di avvio/splash]</w:t>
+        <w:t>[Screenshot: schermata di avvio/splash]</w:t>
       </w:r>
     </w:p>
     <w:p>
@@ -2130,7 +2137,7 @@
           <w:sz w:val="40"/>
           <w:szCs w:val="40"/>
         </w:rPr>
-        <w:t xml:space="preserve">3.2 Uso delle funzionalità</w:t>
+        <w:t>3.2 Uso delle funzionalità</w:t>
       </w:r>
     </w:p>
     <w:p>
@@ -2149,7 +2156,7 @@
           <w:sz w:val="40"/>
           <w:szCs w:val="40"/>
         </w:rPr>
-        <w:t xml:space="preserve">3.2.1 Ospite (senza registrazione)</w:t>
+        <w:t>3.2.1 Ospite (senza registrazione)</w:t>
       </w:r>
     </w:p>
     <w:p>
@@ -2165,7 +2172,7 @@
           <w:sz w:val="28"/>
           <w:szCs w:val="28"/>
         </w:rPr>
-        <w:t xml:space="preserve">Dalla schermata di accesso è possibile scegliere “Continua come ospite”. Si accede alle funzioni che non richiedono un account: cercare ristoranti e leggerne le recensioni.</w:t>
+        <w:t>Dalla schermata di accesso è possibile scegliere “Continua come ospite”. Si accede alle funzioni che non richiedono un account: cercare ristoranti e leggerne le recensioni.</w:t>
       </w:r>
     </w:p>
     <w:p>
@@ -2181,7 +2188,7 @@
           <w:sz w:val="28"/>
           <w:szCs w:val="28"/>
         </w:rPr>
-        <w:t xml:space="preserve">Nella schermata Home, l'ospite indica il nome della propria località e può cercare ristoranti per nome, città, tipo di cucina, fascia di prezzo, disponibilità di prenotazione online e di consegna a domicilio, oppure usare il pulsante “Vicino a me” per vedere i ristoranti più vicini al luogo indicato. Aprendo la scheda di un ristorante è possibile consultarne dettagli, valutazione e recensioni.</w:t>
+        <w:t>Nella schermata Home, l'ospite indica il nome della propria località e può cercare ristoranti per nome, città, tipo di cucina, fascia di prezzo, disponibilità di prenotazione online e di consegna a domicilio, oppure usare il pulsante “Vicino a me” per vedere i ristoranti più vicini al luogo indicato. Aprendo la scheda di un ristorante è possibile consultarne dettagli, valutazione e recensioni.</w:t>
       </w:r>
     </w:p>
     <w:p>
@@ -2197,7 +2204,7 @@
           <w:sz w:val="28"/>
           <w:szCs w:val="28"/>
         </w:rPr>
-        <w:t xml:space="preserve">[Screenshot: Home, Risultati, Dettaglio]</w:t>
+        <w:t>[Screenshot: Home, Risultati, Dettaglio]</w:t>
       </w:r>
     </w:p>
     <w:p>
@@ -2216,7 +2223,7 @@
           <w:sz w:val="40"/>
           <w:szCs w:val="40"/>
         </w:rPr>
-        <w:t xml:space="preserve">3.2.2 Cliente registrato</w:t>
+        <w:t>3.2.2 Cliente registrato</w:t>
       </w:r>
     </w:p>
     <w:p>
@@ -2232,7 +2239,7 @@
           <w:sz w:val="28"/>
           <w:szCs w:val="28"/>
         </w:rPr>
-        <w:t xml:space="preserve">Dal menu di avvio scegliere “Accedi” e inserire username e password, oppure “Non hai un account? Registrati” per crearne uno. Per registrarsi è necessario indicare nome, cognome, username, email, domicilio, una password (con relativa conferma) e il ruolo “Cliente”.</w:t>
+        <w:t>Dal menu di avvio scegliere “Accedi” e inserire username e password, oppure “Non hai un account? Registrati” per crearne uno. Per registrarsi è necessario indicare nome, cognome, username, email, domicilio, una password (con relativa conferma) e il ruolo “Cliente”.</w:t>
       </w:r>
     </w:p>
     <w:p>
@@ -2248,7 +2255,7 @@
           <w:sz w:val="28"/>
           <w:szCs w:val="28"/>
         </w:rPr>
-        <w:t xml:space="preserve">Con un account Cliente, oltre alle funzioni dell'ospite, si può:</w:t>
+        <w:t>Con un account Cliente, oltre alle funzioni dell'ospite, si può:</w:t>
       </w:r>
     </w:p>
     <w:p>
@@ -2269,7 +2276,7 @@
           <w:sz w:val="28"/>
           <w:szCs w:val="28"/>
         </w:rPr>
-        <w:t xml:space="preserve">aggiungere un ristorante alla propria lista dei preferiti e rimuoverlo dalla schermata Preferiti;</w:t>
+        <w:t>aggiungere un ristorante alla propria lista dei preferiti e rimuoverlo dalla schermata Preferiti;</w:t>
       </w:r>
     </w:p>
     <w:p>
@@ -2290,7 +2297,7 @@
           <w:sz w:val="28"/>
           <w:szCs w:val="28"/>
         </w:rPr>
-        <w:t xml:space="preserve">scrivere una recensione (da 1 a 5 stelle e un testo) per un ristorante dal pulsante Scrivi recensione;</w:t>
+        <w:t>scrivere una recensione (da 1 a 5 stelle e un testo) per un ristorante dal pulsante Scrivi recensione;</w:t>
       </w:r>
     </w:p>
     <w:p>
@@ -2311,7 +2318,7 @@
           <w:sz w:val="28"/>
           <w:szCs w:val="28"/>
         </w:rPr>
-        <w:t xml:space="preserve">modificare ed eliminare le proprie recensioni dalla schermata che elenca i ristoranti per cui si è recensito.</w:t>
+        <w:t>modificare ed eliminare le proprie recensioni dalla schermata che elenca i ristoranti per cui si è recensito.</w:t>
       </w:r>
     </w:p>
     <w:p>
@@ -2327,7 +2334,7 @@
           <w:sz w:val="28"/>
           <w:szCs w:val="28"/>
         </w:rPr>
-        <w:t xml:space="preserve">[Screenshot: Login, Registrazione, Preferiti, Scrivi recensione]</w:t>
+        <w:t>[Screenshot: Login, Registrazione, Preferiti, Scrivi recensione]</w:t>
       </w:r>
     </w:p>
     <w:p>
@@ -2346,7 +2353,7 @@
           <w:sz w:val="40"/>
           <w:szCs w:val="40"/>
         </w:rPr>
-        <w:t xml:space="preserve">3.2.3 Ristoratore registrato</w:t>
+        <w:t>3.2.3 Ristoratore registrato</w:t>
       </w:r>
     </w:p>
     <w:p>
@@ -2362,7 +2369,8 @@
           <w:sz w:val="28"/>
           <w:szCs w:val="28"/>
         </w:rPr>
-        <w:t xml:space="preserve">La registrazione come “Ristoratore” abilita le funzioni di gestione dei ristoranti. Nella Dashboard il ristoratore può:</w:t>
+        <w:lastRenderedPageBreak/>
+        <w:t>La registrazione come “Ristoratore” abilita le funzioni di gestione dei ristoranti. Nella Dashboard il ristoratore può:</w:t>
       </w:r>
     </w:p>
     <w:p>
@@ -2383,7 +2391,7 @@
           <w:sz w:val="28"/>
           <w:szCs w:val="28"/>
         </w:rPr>
-        <w:t xml:space="preserve">aggiungere un nuovo ristorante, indicando nome, indirizzo completo (con provincia), città, nazione, fascia di prezzo, servizi, telefono e sito web;</w:t>
+        <w:t>aggiungere un nuovo ristorante, indicando nome, indirizzo completo (con provincia), città, nazione, fascia di prezzo, servizi, telefono e sito web;</w:t>
       </w:r>
     </w:p>
     <w:p>
@@ -2404,7 +2412,7 @@
           <w:sz w:val="28"/>
           <w:szCs w:val="28"/>
         </w:rPr>
-        <w:t xml:space="preserve">visualizzare i ristoranti gestiti e la loro valutazione media (media delle stelle e numero di recensioni ricevute);</w:t>
+        <w:t>visualizzare i ristoranti gestiti e la loro valutazione media (media delle stelle e numero di recensioni ricevute);</w:t>
       </w:r>
     </w:p>
     <w:p>
@@ -2425,7 +2433,7 @@
           <w:sz w:val="28"/>
           <w:szCs w:val="28"/>
         </w:rPr>
-        <w:t xml:space="preserve">leggere le recensioni ricevute dai propri ristoranti e rispondere a ciascuna di esse (al massimo una risposta per recensione).</w:t>
+        <w:t>leggere le recensioni ricevute dai propri ristoranti e rispondere a ciascuna di esse (al massimo una risposta per recensione).</w:t>
       </w:r>
     </w:p>
     <w:p>
@@ -2441,7 +2449,7 @@
           <w:sz w:val="28"/>
           <w:szCs w:val="28"/>
         </w:rPr>
-        <w:t xml:space="preserve">[Screenshot: Dashboard, Aggiungi ristorante, Associa ristorante]</w:t>
+        <w:t>[Screenshot: Dashboard, Aggiungi ristorante, Associa ristorante]</w:t>
       </w:r>
     </w:p>
     <w:p>
@@ -2460,7 +2468,7 @@
           <w:sz w:val="52"/>
           <w:szCs w:val="52"/>
         </w:rPr>
-        <w:t xml:space="preserve">4. Data set di test</w:t>
+        <w:t>4. Data set di test</w:t>
       </w:r>
     </w:p>
     <w:p>
@@ -2476,7 +2484,7 @@
           <w:sz w:val="28"/>
           <w:szCs w:val="28"/>
         </w:rPr>
-        <w:t xml:space="preserve">Per provare il programma senza creare dati propri, il database viene caricato con un data set di ristoranti di prova (tratto dalla guida Michelin, circa 63.000 ristoranti con nome, località, indirizzo, coordinate, fascia di prezzo, tipo di cucina e servizi). È inoltre fornito un insieme di utenti di prova per accedere subito sia come cliente sia come ristoratore, descritto nel file Progettazione/1_Doc. Conclusi/Database/DataUtentiTest.sql.</w:t>
+        <w:t>Per provare il programma senza creare dati propri, il database viene caricato con un data set di ristoranti di prova (tratto dalla guida Michelin, circa 63.000 ristoranti con nome, località, indirizzo, coordinate, fascia di prezzo, tipo di cucina e servizi). È inoltre fornito un insieme di utenti di prova per accedere subito sia come cliente sia come ristoratore, descritto nel file Progettazione/1_Doc. Conclusi/Database/DataUtentiTest.sql.</w:t>
       </w:r>
     </w:p>
     <w:p>
@@ -2495,7 +2503,7 @@
           <w:sz w:val="40"/>
           <w:szCs w:val="40"/>
         </w:rPr>
-        <w:t xml:space="preserve">4.1 Utenti di prova per l'accesso</w:t>
+        <w:t>4.1 Utenti di prova per l'accesso</w:t>
       </w:r>
     </w:p>
     <w:p>
@@ -2511,7 +2519,7 @@
           <w:sz w:val="28"/>
           <w:szCs w:val="28"/>
         </w:rPr>
-        <w:t xml:space="preserve">Per provare subito l'applicazione, accedendo sia come cliente sia come ristoratore, sono disponibili alcuni account già pronti. In tutti la password è “password”:</w:t>
+        <w:t>Per provare subito l'applicazione, accedendo sia come cliente sia come ristoratore, sono disponibili alcuni account già pronti. In tutti la password è “password”:</w:t>
       </w:r>
     </w:p>
     <w:p>
@@ -2532,7 +2540,7 @@
           <w:sz w:val="28"/>
           <w:szCs w:val="28"/>
         </w:rPr>
-        <w:t xml:space="preserve">cliente_test / password — Cliente, Mario Rossi;</w:t>
+        <w:t>cliente_test / password — Cliente, Mario Rossi;</w:t>
       </w:r>
     </w:p>
     <w:p>
@@ -2553,7 +2561,7 @@
           <w:sz w:val="28"/>
           <w:szCs w:val="28"/>
         </w:rPr>
-        <w:t xml:space="preserve">cliente_test2 / password — Cliente, Giulia Verdi;</w:t>
+        <w:t>cliente_test2 / password — Cliente, Giulia Verdi;</w:t>
       </w:r>
     </w:p>
     <w:p>
@@ -2574,7 +2582,7 @@
           <w:sz w:val="28"/>
           <w:szCs w:val="28"/>
         </w:rPr>
-        <w:t xml:space="preserve">gestore_test / password — Ristoratore, Luca Bianchi;</w:t>
+        <w:t>gestore_test / password — Ristoratore, Luca Bianchi;</w:t>
       </w:r>
     </w:p>
     <w:p>
@@ -2595,7 +2603,7 @@
           <w:sz w:val="28"/>
           <w:szCs w:val="28"/>
         </w:rPr>
-        <w:t xml:space="preserve">gestore_test2 / password — Ristoratore, Anna Neri.</w:t>
+        <w:t>gestore_test2 / password — Ristoratore, Anna Neri.</w:t>
       </w:r>
     </w:p>
     <w:p>
@@ -2614,7 +2622,7 @@
           <w:sz w:val="52"/>
           <w:szCs w:val="52"/>
         </w:rPr>
-        <w:t xml:space="preserve">5. Limiti della soluzione sviluppata</w:t>
+        <w:t>5. Limiti della soluzione sviluppata</w:t>
       </w:r>
     </w:p>
     <w:p>
@@ -2635,7 +2643,7 @@
           <w:sz w:val="28"/>
           <w:szCs w:val="28"/>
         </w:rPr>
-        <w:t xml:space="preserve">Le funzioni di geolocalizzazione (ricerca “Vicino a me”, suggerimento della località iniziale, coordinate dei ristoranti inseriti) dipendono da servizi esterni gratuiti (Nominatim e ip-api.com). Se il servizio non è raggiungibile o la rete è assente, il programma continua a funzionare con valori di fallback (es. la località va digitata a mano); in alcuni casi i ristoranti senza coordinate non compaiono fra i risultati “Vicino a me”.</w:t>
+        <w:t>Le funzioni di geolocalizzazione (ricerca “Vicino a me”, suggerimento della località iniziale, coordinate dei ristoranti inseriti) dipendono da servizi esterni gratuiti (Nominatim e ip-api.com). Se il servizio non è raggiungibile o la rete è assente, il programma continua a funzionare con valori di fallback (es. la località va digitata a mano); in alcuni casi i ristoranti senza coordinate non compaiono fra i risultati “Vicino a me”.</w:t>
       </w:r>
     </w:p>
     <w:p>
@@ -2656,7 +2664,8 @@
           <w:sz w:val="28"/>
           <w:szCs w:val="28"/>
         </w:rPr>
-        <w:t xml:space="preserve">Su reti locali o private (es. localhost, LAN, connessioni CGNAT) l'IP non è geolocalizzabile: il suggerimento automatico della località può non comparire, e in tal caso è sempre possibile indicarla manualmente.</w:t>
+        <w:lastRenderedPageBreak/>
+        <w:t>Su reti locali o private (es. localhost, LAN, connessioni CGNAT) l'IP non è geolocalizzabile: il suggerimento automatico della località può non comparire, e in tal caso è sempre possibile indicarla manualmente.</w:t>
       </w:r>
     </w:p>
     <w:p>
@@ -2677,7 +2686,7 @@
           <w:sz w:val="28"/>
           <w:szCs w:val="28"/>
         </w:rPr>
-        <w:t xml:space="preserve">La ricerca “Vicino a me” copre i ristoranti entro un raggio massimo di alcuni chilometri dal luogo indicato.</w:t>
+        <w:t>La ricerca “Vicino a me” copre i ristoranti entro un raggio massimo di alcuni chilometri dal luogo indicato.</w:t>
       </w:r>
     </w:p>
     <w:p>
@@ -2698,7 +2707,7 @@
           <w:sz w:val="28"/>
           <w:szCs w:val="28"/>
         </w:rPr>
-        <w:t xml:space="preserve">Le password non sono salvate in chiaro: in caso di smarrimento non è possibile recuperarle, serve creare un nuovo account.</w:t>
+        <w:t>Le password non sono salvate in chiaro: in caso di smarrimento non è possibile recuperarle, serve creare un nuovo account.</w:t>
       </w:r>
     </w:p>
     <w:p>
@@ -2717,7 +2726,7 @@
           <w:sz w:val="52"/>
           <w:szCs w:val="52"/>
         </w:rPr>
-        <w:t xml:space="preserve">6. Sitografia / Bibliografia</w:t>
+        <w:t>6. Sitografia / Bibliografia</w:t>
       </w:r>
     </w:p>
     <w:p>
@@ -2738,7 +2747,7 @@
           <w:sz w:val="28"/>
           <w:szCs w:val="28"/>
         </w:rPr>
-        <w:t xml:space="preserve">PostgreSQL, Online: https://www.postgresql.org/</w:t>
+        <w:t>PostgreSQL, Online: https://www.postgresql.org/</w:t>
       </w:r>
     </w:p>
     <w:p>
@@ -2759,7 +2768,7 @@
           <w:sz w:val="28"/>
           <w:szCs w:val="28"/>
         </w:rPr>
-        <w:t xml:space="preserve">Oracle Java SDK/JDK, Online: https://www.oracle.com/java/</w:t>
+        <w:t>Oracle Java SDK/JDK, Online: https://www.oracle.com/java/</w:t>
       </w:r>
     </w:p>
     <w:p>
@@ -2780,7 +2789,7 @@
           <w:sz w:val="28"/>
           <w:szCs w:val="28"/>
         </w:rPr>
-        <w:t xml:space="preserve">Apache Maven, Online: https://maven.apache.org/</w:t>
+        <w:t>Apache Maven, Online: https://maven.apache.org/</w:t>
       </w:r>
     </w:p>
     <w:p>
@@ -2801,7 +2810,7 @@
           <w:sz w:val="28"/>
           <w:szCs w:val="28"/>
         </w:rPr>
-        <w:t xml:space="preserve">JavaFX, Online: https://openjfx.io/</w:t>
+        <w:t>JavaFX, Online: https://openjfx.io/</w:t>
       </w:r>
     </w:p>
     <w:p>
@@ -2822,7 +2831,7 @@
           <w:sz w:val="28"/>
           <w:szCs w:val="28"/>
         </w:rPr>
-        <w:t xml:space="preserve">Nominatim / OpenStreetMap, Online: https://nominatim.openstreetmap.org/</w:t>
+        <w:t>Nominatim / OpenStreetMap, Online: https://nominatim.openstreetmap.org/</w:t>
       </w:r>
     </w:p>
     <w:p>
@@ -2843,7 +2852,7 @@
           <w:sz w:val="28"/>
           <w:szCs w:val="28"/>
         </w:rPr>
-        <w:t xml:space="preserve">IP-API, Online: https://ip-api.com/</w:t>
+        <w:t>IP-API, Online: https://ip-api.com/</w:t>
       </w:r>
     </w:p>
     <w:p>
@@ -2864,7 +2873,7 @@
           <w:sz w:val="28"/>
           <w:szCs w:val="28"/>
         </w:rPr>
-        <w:t xml:space="preserve">BCrypt, Online: https://github.com/patrickfav/bcrypt</w:t>
+        <w:t>BCrypt, Online: https://github.com/patrickfav/bcrypt</w:t>
       </w:r>
     </w:p>
     <w:p>
@@ -2885,7 +2894,7 @@
           <w:sz w:val="28"/>
           <w:szCs w:val="28"/>
         </w:rPr>
-        <w:t xml:space="preserve">TheFork — la piattaforma di riferimento, Online: https://www.thefork.it/</w:t>
+        <w:t>TheFork — la piattaforma di riferimento, Online: https://www.thefork.it/</w:t>
       </w:r>
     </w:p>
     <w:p>
@@ -2906,7 +2915,7 @@
           <w:sz w:val="28"/>
           <w:szCs w:val="28"/>
         </w:rPr>
-        <w:t xml:space="preserve">Guida Michelin — data set dei ristoranti, Online: https://www.kaggle.com/datasets/ngshiheng/michelin-guide-restaurants-2021</w:t>
+        <w:t>Guida Michelin — data set dei ristoranti, Online: https://www.kaggle.com/datasets/ngshiheng/michelin-guide-restaurants-2021</w:t>
       </w:r>
     </w:p>
     <w:sectPr>
@@ -6732,6 +6741,7 @@
   <w:style w:type="character" w:default="1" w:styleId="Carpredefinitoparagrafo">
     <w:name w:val="Default Paragraph Font"/>
     <w:uiPriority w:val="1"/>
+    <w:semiHidden/>
     <w:unhideWhenUsed/>
   </w:style>
   <w:style w:type="table" w:default="1" w:styleId="Tabellanormale">

</xml_diff>